<commit_message>
DOC for LCP01 updated
</commit_message>
<xml_diff>
--- a/6. Documentation With Templates/LCP01/LCP01-AIRBAG-ECU-001_Concept_v110.docx
+++ b/6. Documentation With Templates/LCP01/LCP01-AIRBAG-ECU-001_Concept_v110.docx
@@ -211,7 +211,15 @@
                 <w:sz w:val="18"/>
                 <w:szCs w:val="18"/>
               </w:rPr>
-              <w:t>LCP01-AIRBAG-ECU-001</w:t>
+              <w:t>LCP01-AIRBAG-ECU-0</w:t>
+            </w:r>
+            <w:r>
+              <w:rPr>
+                <w:color w:val="000000"/>
+                <w:sz w:val="18"/>
+                <w:szCs w:val="18"/>
+              </w:rPr>
+              <w:t>01</w:t>
             </w:r>
           </w:p>
         </w:tc>
@@ -333,7 +341,31 @@
                 <w:sz w:val="18"/>
                 <w:szCs w:val="18"/>
               </w:rPr>
-              <w:t>2026-05-17</w:t>
+              <w:t>2026-0</w:t>
+            </w:r>
+            <w:r>
+              <w:rPr>
+                <w:color w:val="000000"/>
+                <w:sz w:val="18"/>
+                <w:szCs w:val="18"/>
+              </w:rPr>
+              <w:t>5</w:t>
+            </w:r>
+            <w:r>
+              <w:rPr>
+                <w:color w:val="000000"/>
+                <w:sz w:val="18"/>
+                <w:szCs w:val="18"/>
+              </w:rPr>
+              <w:t>-</w:t>
+            </w:r>
+            <w:r>
+              <w:rPr>
+                <w:color w:val="000000"/>
+                <w:sz w:val="18"/>
+                <w:szCs w:val="18"/>
+              </w:rPr>
+              <w:t>01</w:t>
             </w:r>
           </w:p>
         </w:tc>
@@ -412,7 +444,41 @@
                 <w:sz w:val="18"/>
                 <w:szCs w:val="18"/>
               </w:rPr>
-              <w:t>HS Harz FuSa — Systems Safety Engineering Team</w:t>
+              <w:t xml:space="preserve">HS Harz </w:t>
+            </w:r>
+            <w:proofErr w:type="spellStart"/>
+            <w:r>
+              <w:rPr>
+                <w:color w:val="000000"/>
+                <w:sz w:val="18"/>
+                <w:szCs w:val="18"/>
+              </w:rPr>
+              <w:t>FuSa</w:t>
+            </w:r>
+            <w:proofErr w:type="spellEnd"/>
+            <w:r>
+              <w:rPr>
+                <w:color w:val="000000"/>
+                <w:sz w:val="18"/>
+                <w:szCs w:val="18"/>
+              </w:rPr>
+              <w:t xml:space="preserve"> — </w:t>
+            </w:r>
+            <w:r>
+              <w:rPr>
+                <w:color w:val="000000"/>
+                <w:sz w:val="18"/>
+                <w:szCs w:val="18"/>
+              </w:rPr>
+              <w:t>Project Management</w:t>
+            </w:r>
+            <w:r>
+              <w:rPr>
+                <w:color w:val="000000"/>
+                <w:sz w:val="18"/>
+                <w:szCs w:val="18"/>
+              </w:rPr>
+              <w:t xml:space="preserve"> Team</w:t>
             </w:r>
           </w:p>
         </w:tc>
@@ -1851,9 +1917,9 @@
       </w:tblPr>
       <w:tblGrid>
         <w:gridCol w:w="2302"/>
-        <w:gridCol w:w="1521"/>
-        <w:gridCol w:w="1984"/>
-        <w:gridCol w:w="4263"/>
+        <w:gridCol w:w="1379"/>
+        <w:gridCol w:w="2410"/>
+        <w:gridCol w:w="3979"/>
       </w:tblGrid>
       <w:tr>
         <w:tc>
@@ -1877,7 +1943,7 @@
         </w:tc>
         <w:tc>
           <w:tcPr>
-            <w:tcW w:w="1521" w:type="dxa"/>
+            <w:tcW w:w="1379" w:type="dxa"/>
           </w:tcPr>
           <w:p>
             <w:pPr>
@@ -1896,7 +1962,7 @@
         </w:tc>
         <w:tc>
           <w:tcPr>
-            <w:tcW w:w="1984" w:type="dxa"/>
+            <w:tcW w:w="2410" w:type="dxa"/>
           </w:tcPr>
           <w:p>
             <w:pPr>
@@ -1915,7 +1981,7 @@
         </w:tc>
         <w:tc>
           <w:tcPr>
-            <w:tcW w:w="4263" w:type="dxa"/>
+            <w:tcW w:w="3979" w:type="dxa"/>
           </w:tcPr>
           <w:p>
             <w:pPr>
@@ -1951,7 +2017,7 @@
               <w:spacing w:line="360" w:lineRule="auto"/>
             </w:pPr>
             <w:r>
-              <w:t xml:space="preserve">Project Kick-off &amp; </w:t>
+              <w:t>Project Kick-off &amp;</w:t>
             </w:r>
             <w:r>
               <w:t xml:space="preserve">Goal Approval </w:t>
@@ -1960,36 +2026,76 @@
         </w:tc>
         <w:tc>
           <w:tcPr>
-            <w:tcW w:w="1521" w:type="dxa"/>
-          </w:tcPr>
-          <w:p>
-            <w:pPr>
-              <w:spacing w:line="360" w:lineRule="auto"/>
-            </w:pPr>
-            <w:r>
-              <w:rPr>
-                <w:color w:val="000000"/>
-              </w:rPr>
-              <w:t>2026-05-03, 10:00</w:t>
-            </w:r>
-          </w:p>
-        </w:tc>
-        <w:tc>
-          <w:tcPr>
-            <w:tcW w:w="1984" w:type="dxa"/>
-          </w:tcPr>
-          <w:p>
-            <w:pPr>
-              <w:spacing w:line="360" w:lineRule="auto"/>
-            </w:pPr>
-            <w:r>
-              <w:t>All Team members</w:t>
-            </w:r>
-          </w:p>
-        </w:tc>
-        <w:tc>
-          <w:tcPr>
-            <w:tcW w:w="4263" w:type="dxa"/>
+            <w:tcW w:w="1379" w:type="dxa"/>
+          </w:tcPr>
+          <w:p>
+            <w:pPr>
+              <w:spacing w:line="360" w:lineRule="auto"/>
+            </w:pPr>
+            <w:r>
+              <w:rPr>
+                <w:color w:val="000000"/>
+              </w:rPr>
+              <w:t>2026-05-0</w:t>
+            </w:r>
+            <w:r>
+              <w:rPr>
+                <w:color w:val="000000"/>
+              </w:rPr>
+              <w:t>1</w:t>
+            </w:r>
+            <w:r>
+              <w:rPr>
+                <w:color w:val="000000"/>
+              </w:rPr>
+              <w:t>, 10:00</w:t>
+            </w:r>
+          </w:p>
+        </w:tc>
+        <w:tc>
+          <w:tcPr>
+            <w:tcW w:w="2410" w:type="dxa"/>
+          </w:tcPr>
+          <w:p>
+            <w:pPr>
+              <w:spacing w:line="360" w:lineRule="auto"/>
+            </w:pPr>
+            <w:r>
+              <w:t xml:space="preserve">Alita Shrestha, </w:t>
+            </w:r>
+            <w:r>
+              <w:br/>
+            </w:r>
+            <w:r>
+              <w:t>Mariana Chavez Avila, Mrunal S. Ghotekar,</w:t>
+            </w:r>
+            <w:r>
+              <w:t xml:space="preserve"> </w:t>
+            </w:r>
+            <w:r>
+              <w:t>Om Naik</w:t>
+            </w:r>
+            <w:r>
+              <w:t xml:space="preserve">, </w:t>
+            </w:r>
+          </w:p>
+          <w:p>
+            <w:pPr>
+              <w:spacing w:line="360" w:lineRule="auto"/>
+            </w:pPr>
+            <w:proofErr w:type="spellStart"/>
+            <w:r>
+              <w:t>Thirthashri</w:t>
+            </w:r>
+            <w:proofErr w:type="spellEnd"/>
+            <w:r>
+              <w:t xml:space="preserve"> Gowli Ganesh</w:t>
+            </w:r>
+          </w:p>
+        </w:tc>
+        <w:tc>
+          <w:tcPr>
+            <w:tcW w:w="3979" w:type="dxa"/>
           </w:tcPr>
           <w:p>
             <w:pPr>
@@ -2031,7 +2137,7 @@
         </w:tc>
         <w:tc>
           <w:tcPr>
-            <w:tcW w:w="1521" w:type="dxa"/>
+            <w:tcW w:w="1379" w:type="dxa"/>
           </w:tcPr>
           <w:p>
             <w:pPr>
@@ -2047,7 +2153,13 @@
               <w:rPr>
                 <w:color w:val="000000"/>
               </w:rPr>
-              <w:t>05</w:t>
+              <w:t>0</w:t>
+            </w:r>
+            <w:r>
+              <w:rPr>
+                <w:color w:val="000000"/>
+              </w:rPr>
+              <w:t>2</w:t>
             </w:r>
             <w:r>
               <w:rPr>
@@ -2059,7 +2171,7 @@
         </w:tc>
         <w:tc>
           <w:tcPr>
-            <w:tcW w:w="1984" w:type="dxa"/>
+            <w:tcW w:w="2410" w:type="dxa"/>
           </w:tcPr>
           <w:p>
             <w:pPr>
@@ -2131,7 +2243,7 @@
         </w:tc>
         <w:tc>
           <w:tcPr>
-            <w:tcW w:w="4263" w:type="dxa"/>
+            <w:tcW w:w="3979" w:type="dxa"/>
           </w:tcPr>
           <w:p>
             <w:pPr>
@@ -3235,8 +3347,17 @@
                 <w:rFonts w:eastAsia="Times New Roman"/>
                 <w:color w:val="1F2328"/>
               </w:rPr>
-              <w:t>Mobina Ketabi</w:t>
-            </w:r>
+              <w:t xml:space="preserve">Mobina </w:t>
+            </w:r>
+            <w:proofErr w:type="spellStart"/>
+            <w:r>
+              <w:rPr>
+                <w:rFonts w:eastAsia="Times New Roman"/>
+                <w:color w:val="1F2328"/>
+              </w:rPr>
+              <w:t>Ketabi</w:t>
+            </w:r>
+            <w:proofErr w:type="spellEnd"/>
           </w:p>
         </w:tc>
       </w:tr>
@@ -3331,7 +3452,23 @@
                 <w:rFonts w:eastAsia="Times New Roman"/>
                 <w:color w:val="1F2328"/>
               </w:rPr>
-              <w:t>Mrunal Sahebrao Ghotekar</w:t>
+              <w:t xml:space="preserve">Mrunal </w:t>
+            </w:r>
+            <w:proofErr w:type="spellStart"/>
+            <w:r>
+              <w:rPr>
+                <w:rFonts w:eastAsia="Times New Roman"/>
+                <w:color w:val="1F2328"/>
+              </w:rPr>
+              <w:t>Sahebrao</w:t>
+            </w:r>
+            <w:proofErr w:type="spellEnd"/>
+            <w:r>
+              <w:rPr>
+                <w:rFonts w:eastAsia="Times New Roman"/>
+                <w:color w:val="1F2328"/>
+              </w:rPr>
+              <w:t xml:space="preserve"> Ghotekar</w:t>
             </w:r>
           </w:p>
         </w:tc>
@@ -3374,12 +3511,21 @@
                 <w:color w:val="1F2328"/>
               </w:rPr>
             </w:pPr>
+            <w:proofErr w:type="spellStart"/>
             <w:r>
               <w:rPr>
                 <w:rFonts w:eastAsia="Times New Roman"/>
                 <w:color w:val="1F2328"/>
               </w:rPr>
-              <w:t>Thirthashri Gowli Ganesh</w:t>
+              <w:t>Thirthashri</w:t>
+            </w:r>
+            <w:proofErr w:type="spellEnd"/>
+            <w:r>
+              <w:rPr>
+                <w:rFonts w:eastAsia="Times New Roman"/>
+                <w:color w:val="1F2328"/>
+              </w:rPr>
+              <w:t xml:space="preserve"> Gowli Ganesh</w:t>
             </w:r>
           </w:p>
         </w:tc>
@@ -3475,8 +3621,17 @@
                 <w:rFonts w:eastAsia="Times New Roman"/>
                 <w:color w:val="1F2328"/>
               </w:rPr>
-              <w:t>Atharva Banarase</w:t>
-            </w:r>
+              <w:t xml:space="preserve">Atharva </w:t>
+            </w:r>
+            <w:proofErr w:type="spellStart"/>
+            <w:r>
+              <w:rPr>
+                <w:rFonts w:eastAsia="Times New Roman"/>
+                <w:color w:val="1F2328"/>
+              </w:rPr>
+              <w:t>Banarase</w:t>
+            </w:r>
+            <w:proofErr w:type="spellEnd"/>
           </w:p>
         </w:tc>
       </w:tr>
@@ -3566,13 +3721,47 @@
                 <w:color w:val="1F2328"/>
               </w:rPr>
             </w:pPr>
+            <w:proofErr w:type="spellStart"/>
             <w:r>
               <w:rPr>
                 <w:rFonts w:eastAsia="Times New Roman"/>
                 <w:color w:val="1F2328"/>
               </w:rPr>
-              <w:t>Sathyashree Vignasante Ramegowda</w:t>
-            </w:r>
+              <w:t>Sathyashree</w:t>
+            </w:r>
+            <w:proofErr w:type="spellEnd"/>
+            <w:r>
+              <w:rPr>
+                <w:rFonts w:eastAsia="Times New Roman"/>
+                <w:color w:val="1F2328"/>
+              </w:rPr>
+              <w:t xml:space="preserve"> </w:t>
+            </w:r>
+            <w:proofErr w:type="spellStart"/>
+            <w:r>
+              <w:rPr>
+                <w:rFonts w:eastAsia="Times New Roman"/>
+                <w:color w:val="1F2328"/>
+              </w:rPr>
+              <w:t>Vignasante</w:t>
+            </w:r>
+            <w:proofErr w:type="spellEnd"/>
+            <w:r>
+              <w:rPr>
+                <w:rFonts w:eastAsia="Times New Roman"/>
+                <w:color w:val="1F2328"/>
+              </w:rPr>
+              <w:t xml:space="preserve"> </w:t>
+            </w:r>
+            <w:proofErr w:type="spellStart"/>
+            <w:r>
+              <w:rPr>
+                <w:rFonts w:eastAsia="Times New Roman"/>
+                <w:color w:val="1F2328"/>
+              </w:rPr>
+              <w:t>Ramegowda</w:t>
+            </w:r>
+            <w:proofErr w:type="spellEnd"/>
           </w:p>
         </w:tc>
       </w:tr>
@@ -3619,8 +3808,17 @@
                 <w:rFonts w:eastAsia="Times New Roman"/>
                 <w:color w:val="1F2328"/>
               </w:rPr>
-              <w:t>Atharva Prasad Avsare</w:t>
-            </w:r>
+              <w:t xml:space="preserve">Atharva Prasad </w:t>
+            </w:r>
+            <w:proofErr w:type="spellStart"/>
+            <w:r>
+              <w:rPr>
+                <w:rFonts w:eastAsia="Times New Roman"/>
+                <w:color w:val="1F2328"/>
+              </w:rPr>
+              <w:t>Avsare</w:t>
+            </w:r>
+            <w:proofErr w:type="spellEnd"/>
           </w:p>
         </w:tc>
       </w:tr>
@@ -3710,12 +3908,21 @@
                 <w:color w:val="1F2328"/>
               </w:rPr>
             </w:pPr>
+            <w:proofErr w:type="spellStart"/>
             <w:r>
               <w:rPr>
                 <w:rFonts w:eastAsia="Times New Roman"/>
                 <w:color w:val="1F2328"/>
               </w:rPr>
-              <w:t>Shivbaraje Bhosale</w:t>
+              <w:t>Shivbaraje</w:t>
+            </w:r>
+            <w:proofErr w:type="spellEnd"/>
+            <w:r>
+              <w:rPr>
+                <w:rFonts w:eastAsia="Times New Roman"/>
+                <w:color w:val="1F2328"/>
+              </w:rPr>
+              <w:t xml:space="preserve"> Bhosale</w:t>
             </w:r>
           </w:p>
         </w:tc>
@@ -3748,7 +3955,15 @@
         <w:spacing w:after="120"/>
       </w:pPr>
       <w:r>
-        <w:t>In the laboratory implementation, the system is realized on two Arduino Due microcontroller boards operating in a dual-channel (2oo2) redundant architecture. Three potentiometers on a breadboard simulate the analog crash sensor inputs; one digital switch simulates the baby-seat / Occupant Classification System (OCS) input. A CAN bus interface connects the ECU to the OMS laboratory PC for output verification.</w:t>
+        <w:t xml:space="preserve">In the laboratory implementation, the system is realized on two Arduino Due microcontroller boards operating in a dual-channel (2oo2) redundant architecture. Three potentiometers on a breadboard simulate the </w:t>
+      </w:r>
+      <w:proofErr w:type="spellStart"/>
+      <w:r>
+        <w:t>analog</w:t>
+      </w:r>
+      <w:proofErr w:type="spellEnd"/>
+      <w:r>
+        <w:t xml:space="preserve"> crash sensor inputs; one digital switch simulates the baby-seat / Occupant Classification System (OCS) input. A CAN bus interface connects the ECU to the OMS laboratory PC for output verification.</w:t>
       </w:r>
     </w:p>
     <w:p/>
@@ -3815,8 +4030,13 @@
         </w:numPr>
       </w:pPr>
       <w:r>
-        <w:t>Supply voltage: 9–16 V (nominal 12 V); post-crash powering via internal reservoir capacitor for ≥ 150 ms</w:t>
-      </w:r>
+        <w:t xml:space="preserve">Supply voltage: 9–16 V (nominal 12 V); post-crash powering via internal reservoir capacitor for ≥ 150 </w:t>
+      </w:r>
+      <w:proofErr w:type="spellStart"/>
+      <w:r>
+        <w:t>ms</w:t>
+      </w:r>
+      <w:proofErr w:type="spellEnd"/>
     </w:p>
     <w:p>
       <w:pPr>
@@ -3887,7 +4107,15 @@
         <w:t>Crash Detection:</w:t>
       </w:r>
       <w:r>
-        <w:t xml:space="preserve"> continuous monitoring and fusion of accelerometer, gyroscope, and pressure sensor signals; detection of crash events above deployment threshold within ≤ 15 ms.</w:t>
+        <w:t xml:space="preserve"> continuous monitoring and fusion of accelerometer, gyroscope, and pressure sensor signals; detection of crash events above deployment threshold within ≤ 15 </w:t>
+      </w:r>
+      <w:proofErr w:type="spellStart"/>
+      <w:r>
+        <w:t>ms</w:t>
+      </w:r>
+      <w:proofErr w:type="spellEnd"/>
+      <w:r>
+        <w:t>.</w:t>
       </w:r>
     </w:p>
     <w:p>
@@ -3953,7 +4181,15 @@
         <w:t xml:space="preserve"> Sensor Monitoring and Plausibility Check</w:t>
       </w:r>
       <w:r>
-        <w:t>: continuous range checking of all analog inputs (POTI-1, POTI-2, POTI-3) and digital input (baby-seat switch); out-of-range or stuck faults trigger DTC and DWI activation.</w:t>
+        <w:t xml:space="preserve">: continuous range checking of all </w:t>
+      </w:r>
+      <w:proofErr w:type="spellStart"/>
+      <w:r>
+        <w:t>analog</w:t>
+      </w:r>
+      <w:proofErr w:type="spellEnd"/>
+      <w:r>
+        <w:t xml:space="preserve"> inputs (POTI-1, POTI-2, POTI-3) and digital input (baby-seat switch); out-of-range or stuck faults trigger DTC and DWI activation.</w:t>
       </w:r>
     </w:p>
     <w:p>
@@ -3986,7 +4222,23 @@
         <w:t xml:space="preserve"> System Self-Test and Diagnosis:</w:t>
       </w:r>
       <w:r>
-        <w:t xml:space="preserve"> Power-On Self-Test (POST) within 800 ms; background monitoring at ≤ 100 ms intervals; squib loop resistance monitoring; Flash CRC check; watchdog supervision.</w:t>
+        <w:t xml:space="preserve"> Power-On Self-Test (POST) within 800 </w:t>
+      </w:r>
+      <w:proofErr w:type="spellStart"/>
+      <w:r>
+        <w:t>ms</w:t>
+      </w:r>
+      <w:proofErr w:type="spellEnd"/>
+      <w:r>
+        <w:t xml:space="preserve">; background monitoring at ≤ 100 </w:t>
+      </w:r>
+      <w:proofErr w:type="spellStart"/>
+      <w:r>
+        <w:t>ms</w:t>
+      </w:r>
+      <w:proofErr w:type="spellEnd"/>
+      <w:r>
+        <w:t xml:space="preserve"> intervals; squib loop resistance monitoring; Flash CRC check; watchdog supervision.</w:t>
       </w:r>
     </w:p>
     <w:p>
@@ -4052,7 +4304,23 @@
         <w:t xml:space="preserve"> Communication of Safety-Relevant States</w:t>
       </w:r>
       <w:r>
-        <w:t>: CAN crash notification frame transmitted within ≤ 15 ms of deployment decision; DWI lamp activation within ≤ 800 ms of any detected fault.</w:t>
+        <w:t xml:space="preserve">: CAN crash notification frame transmitted within ≤ 15 </w:t>
+      </w:r>
+      <w:proofErr w:type="spellStart"/>
+      <w:r>
+        <w:t>ms</w:t>
+      </w:r>
+      <w:proofErr w:type="spellEnd"/>
+      <w:r>
+        <w:t xml:space="preserve"> of deployment decision; DWI lamp activation within ≤ 800 </w:t>
+      </w:r>
+      <w:proofErr w:type="spellStart"/>
+      <w:r>
+        <w:t>ms</w:t>
+      </w:r>
+      <w:proofErr w:type="spellEnd"/>
+      <w:r>
+        <w:t xml:space="preserve"> of any detected fault.</w:t>
       </w:r>
     </w:p>
     <w:p/>
@@ -4557,15 +4825,15 @@
       </w:tblPr>
       <w:tblGrid>
         <w:gridCol w:w="539"/>
-        <w:gridCol w:w="2589"/>
-        <w:gridCol w:w="1197"/>
-        <w:gridCol w:w="1196"/>
-        <w:gridCol w:w="3839"/>
+        <w:gridCol w:w="2358"/>
+        <w:gridCol w:w="1142"/>
+        <w:gridCol w:w="1091"/>
+        <w:gridCol w:w="4230"/>
       </w:tblGrid>
       <w:tr>
         <w:tc>
           <w:tcPr>
-            <w:tcW w:w="530" w:type="dxa"/>
+            <w:tcW w:w="539" w:type="dxa"/>
           </w:tcPr>
           <w:p>
             <w:pPr>
@@ -4584,7 +4852,7 @@
         </w:tc>
         <w:tc>
           <w:tcPr>
-            <w:tcW w:w="2591" w:type="dxa"/>
+            <w:tcW w:w="2589" w:type="dxa"/>
           </w:tcPr>
           <w:p>
             <w:pPr>
@@ -4603,7 +4871,7 @@
         </w:tc>
         <w:tc>
           <w:tcPr>
-            <w:tcW w:w="1198" w:type="dxa"/>
+            <w:tcW w:w="1197" w:type="dxa"/>
           </w:tcPr>
           <w:p>
             <w:pPr>
@@ -4622,7 +4890,7 @@
         </w:tc>
         <w:tc>
           <w:tcPr>
-            <w:tcW w:w="1197" w:type="dxa"/>
+            <w:tcW w:w="1196" w:type="dxa"/>
           </w:tcPr>
           <w:p>
             <w:pPr>
@@ -4641,7 +4909,7 @@
         </w:tc>
         <w:tc>
           <w:tcPr>
-            <w:tcW w:w="3844" w:type="dxa"/>
+            <w:tcW w:w="3839" w:type="dxa"/>
           </w:tcPr>
           <w:p>
             <w:pPr>
@@ -4662,12 +4930,15 @@
       <w:tr>
         <w:tc>
           <w:tcPr>
-            <w:tcW w:w="530" w:type="dxa"/>
+            <w:tcW w:w="539" w:type="dxa"/>
           </w:tcPr>
           <w:p>
             <w:pPr>
               <w:spacing w:line="360" w:lineRule="auto"/>
               <w:jc w:val="center"/>
+              <w:rPr>
+                <w:color w:val="000000"/>
+              </w:rPr>
             </w:pPr>
             <w:r>
               <w:rPr>
@@ -4679,67 +4950,79 @@
         </w:tc>
         <w:tc>
           <w:tcPr>
-            <w:tcW w:w="2591" w:type="dxa"/>
-          </w:tcPr>
-          <w:p>
-            <w:pPr>
-              <w:spacing w:line="360" w:lineRule="auto"/>
-            </w:pPr>
-            <w:r>
-              <w:rPr>
-                <w:color w:val="000000"/>
-              </w:rPr>
-              <w:t>Hazard and Risk Analysis — Airbag ECU</w:t>
-            </w:r>
-          </w:p>
-        </w:tc>
-        <w:tc>
-          <w:tcPr>
-            <w:tcW w:w="1198" w:type="dxa"/>
+            <w:tcW w:w="2589" w:type="dxa"/>
+          </w:tcPr>
+          <w:p>
+            <w:pPr>
+              <w:spacing w:line="360" w:lineRule="auto"/>
+              <w:rPr>
+                <w:color w:val="000000"/>
+              </w:rPr>
+            </w:pPr>
+            <w:r>
+              <w:rPr>
+                <w:color w:val="000000"/>
+              </w:rPr>
+              <w:t xml:space="preserve">Task of the Process or Product </w:t>
+            </w:r>
+          </w:p>
+        </w:tc>
+        <w:tc>
+          <w:tcPr>
+            <w:tcW w:w="1197" w:type="dxa"/>
           </w:tcPr>
           <w:p>
             <w:pPr>
               <w:spacing w:line="360" w:lineRule="auto"/>
               <w:jc w:val="center"/>
-            </w:pPr>
-            <w:r>
-              <w:rPr>
-                <w:color w:val="000000"/>
-              </w:rPr>
-              <w:t>2</w:t>
-            </w:r>
-          </w:p>
-        </w:tc>
-        <w:tc>
-          <w:tcPr>
-            <w:tcW w:w="1197" w:type="dxa"/>
+              <w:rPr>
+                <w:color w:val="000000"/>
+              </w:rPr>
+            </w:pPr>
+            <w:r>
+              <w:rPr>
+                <w:color w:val="000000"/>
+              </w:rPr>
+              <w:t>1</w:t>
+            </w:r>
+          </w:p>
+        </w:tc>
+        <w:tc>
+          <w:tcPr>
+            <w:tcW w:w="1196" w:type="dxa"/>
           </w:tcPr>
           <w:p>
             <w:pPr>
               <w:spacing w:line="360" w:lineRule="auto"/>
               <w:jc w:val="center"/>
-            </w:pPr>
-            <w:r>
-              <w:rPr>
-                <w:color w:val="000000"/>
-              </w:rPr>
-              <w:t>2026-05-06</w:t>
-            </w:r>
-          </w:p>
-        </w:tc>
-        <w:tc>
-          <w:tcPr>
-            <w:tcW w:w="3844" w:type="dxa"/>
-          </w:tcPr>
-          <w:p>
-            <w:pPr>
-              <w:spacing w:line="360" w:lineRule="auto"/>
-            </w:pPr>
-            <w:r>
+              <w:rPr>
+                <w:color w:val="000000"/>
+              </w:rPr>
+            </w:pPr>
+            <w:r>
+              <w:rPr>
+                <w:color w:val="000000"/>
+              </w:rPr>
+              <w:t>2026-05-02</w:t>
+            </w:r>
+          </w:p>
+        </w:tc>
+        <w:tc>
+          <w:tcPr>
+            <w:tcW w:w="3839" w:type="dxa"/>
+          </w:tcPr>
+          <w:p>
+            <w:pPr>
+              <w:spacing w:line="360" w:lineRule="auto"/>
               <w:rPr>
                 <w:color w:val="1F3864"/>
               </w:rPr>
-              <w:t>HARA-AIRBAG-ECU-001_2.1.pdf</w:t>
+            </w:pPr>
+            <w:r>
+              <w:rPr>
+                <w:color w:val="1F3864"/>
+              </w:rPr>
+              <w:t>LCP02-AIRBAG-ECU-001_Task_of_the_Process_or_Product_v100</w:t>
             </w:r>
           </w:p>
         </w:tc>
@@ -4747,7 +5030,7 @@
       <w:tr>
         <w:tc>
           <w:tcPr>
-            <w:tcW w:w="530" w:type="dxa"/>
+            <w:tcW w:w="539" w:type="dxa"/>
           </w:tcPr>
           <w:p>
             <w:pPr>
@@ -4755,32 +5038,29 @@
               <w:jc w:val="center"/>
             </w:pPr>
             <w:r>
-              <w:rPr>
-                <w:color w:val="000000"/>
-              </w:rPr>
               <w:t>2</w:t>
             </w:r>
           </w:p>
         </w:tc>
         <w:tc>
           <w:tcPr>
-            <w:tcW w:w="2591" w:type="dxa"/>
-          </w:tcPr>
-          <w:p>
-            <w:pPr>
-              <w:spacing w:line="360" w:lineRule="auto"/>
-            </w:pPr>
-            <w:r>
-              <w:rPr>
-                <w:color w:val="000000"/>
-              </w:rPr>
-              <w:t>Safety Concept Document — Airbag ECU</w:t>
-            </w:r>
-          </w:p>
-        </w:tc>
-        <w:tc>
-          <w:tcPr>
-            <w:tcW w:w="1198" w:type="dxa"/>
+            <w:tcW w:w="2589" w:type="dxa"/>
+          </w:tcPr>
+          <w:p>
+            <w:pPr>
+              <w:spacing w:line="360" w:lineRule="auto"/>
+            </w:pPr>
+            <w:r>
+              <w:rPr>
+                <w:color w:val="000000"/>
+              </w:rPr>
+              <w:t xml:space="preserve">Hazard and Risk Analysis </w:t>
+            </w:r>
+          </w:p>
+        </w:tc>
+        <w:tc>
+          <w:tcPr>
+            <w:tcW w:w="1197" w:type="dxa"/>
           </w:tcPr>
           <w:p>
             <w:pPr>
@@ -4797,7 +5077,7 @@
         </w:tc>
         <w:tc>
           <w:tcPr>
-            <w:tcW w:w="1197" w:type="dxa"/>
+            <w:tcW w:w="1196" w:type="dxa"/>
           </w:tcPr>
           <w:p>
             <w:pPr>
@@ -4808,13 +5088,19 @@
               <w:rPr>
                 <w:color w:val="000000"/>
               </w:rPr>
-              <w:t>2026-05-12</w:t>
-            </w:r>
-          </w:p>
-        </w:tc>
-        <w:tc>
-          <w:tcPr>
-            <w:tcW w:w="3844" w:type="dxa"/>
+              <w:t>2026-05-0</w:t>
+            </w:r>
+            <w:r>
+              <w:rPr>
+                <w:color w:val="000000"/>
+              </w:rPr>
+              <w:t>5</w:t>
+            </w:r>
+          </w:p>
+        </w:tc>
+        <w:tc>
+          <w:tcPr>
+            <w:tcW w:w="3839" w:type="dxa"/>
           </w:tcPr>
           <w:p>
             <w:pPr>
@@ -4824,7 +5110,7 @@
               <w:rPr>
                 <w:color w:val="1F3864"/>
               </w:rPr>
-              <w:t>SC-AIRBAG-ECU-001_Rev2.0.pdf</w:t>
+              <w:t>LCP03-AIRBAG-ECU-001_HARA_v100</w:t>
             </w:r>
           </w:p>
         </w:tc>
@@ -4832,7 +5118,7 @@
       <w:tr>
         <w:tc>
           <w:tcPr>
-            <w:tcW w:w="530" w:type="dxa"/>
+            <w:tcW w:w="539" w:type="dxa"/>
           </w:tcPr>
           <w:p>
             <w:pPr>
@@ -4840,32 +5126,29 @@
               <w:jc w:val="center"/>
             </w:pPr>
             <w:r>
-              <w:rPr>
-                <w:color w:val="000000"/>
-              </w:rPr>
               <w:t>3</w:t>
             </w:r>
           </w:p>
         </w:tc>
         <w:tc>
           <w:tcPr>
-            <w:tcW w:w="2591" w:type="dxa"/>
-          </w:tcPr>
-          <w:p>
-            <w:pPr>
-              <w:spacing w:line="360" w:lineRule="auto"/>
-            </w:pPr>
-            <w:r>
-              <w:rPr>
-                <w:color w:val="000000"/>
-              </w:rPr>
-              <w:t>Functional Safety Requirements Specification</w:t>
-            </w:r>
-          </w:p>
-        </w:tc>
-        <w:tc>
-          <w:tcPr>
-            <w:tcW w:w="1198" w:type="dxa"/>
+            <w:tcW w:w="2589" w:type="dxa"/>
+          </w:tcPr>
+          <w:p>
+            <w:pPr>
+              <w:spacing w:line="360" w:lineRule="auto"/>
+            </w:pPr>
+            <w:r>
+              <w:rPr>
+                <w:color w:val="000000"/>
+              </w:rPr>
+              <w:t>Safety Concept Document — Airbag ECU</w:t>
+            </w:r>
+          </w:p>
+        </w:tc>
+        <w:tc>
+          <w:tcPr>
+            <w:tcW w:w="1197" w:type="dxa"/>
           </w:tcPr>
           <w:p>
             <w:pPr>
@@ -4876,13 +5159,13 @@
               <w:rPr>
                 <w:color w:val="000000"/>
               </w:rPr>
-              <w:t>2.1</w:t>
-            </w:r>
-          </w:p>
-        </w:tc>
-        <w:tc>
-          <w:tcPr>
-            <w:tcW w:w="1197" w:type="dxa"/>
+              <w:t>2</w:t>
+            </w:r>
+          </w:p>
+        </w:tc>
+        <w:tc>
+          <w:tcPr>
+            <w:tcW w:w="1196" w:type="dxa"/>
           </w:tcPr>
           <w:p>
             <w:pPr>
@@ -4893,19 +5176,19 @@
               <w:rPr>
                 <w:color w:val="000000"/>
               </w:rPr>
-              <w:t>2026-05-1</w:t>
-            </w:r>
-            <w:r>
-              <w:rPr>
-                <w:color w:val="000000"/>
-              </w:rPr>
-              <w:t>3</w:t>
-            </w:r>
-          </w:p>
-        </w:tc>
-        <w:tc>
-          <w:tcPr>
-            <w:tcW w:w="3844" w:type="dxa"/>
+              <w:t>2026-05-</w:t>
+            </w:r>
+            <w:r>
+              <w:rPr>
+                <w:color w:val="000000"/>
+              </w:rPr>
+              <w:t>10</w:t>
+            </w:r>
+          </w:p>
+        </w:tc>
+        <w:tc>
+          <w:tcPr>
+            <w:tcW w:w="3839" w:type="dxa"/>
           </w:tcPr>
           <w:p>
             <w:pPr>
@@ -4915,7 +5198,7 @@
               <w:rPr>
                 <w:color w:val="1F3864"/>
               </w:rPr>
-              <w:t>FSRS-AIRBAG-ECU-001_Rev2.1.pdf</w:t>
+              <w:t>LCP03-AIRBAG-ECU-001_HARA_v100</w:t>
             </w:r>
           </w:p>
         </w:tc>
@@ -4923,7 +5206,7 @@
       <w:tr>
         <w:tc>
           <w:tcPr>
-            <w:tcW w:w="530" w:type="dxa"/>
+            <w:tcW w:w="539" w:type="dxa"/>
           </w:tcPr>
           <w:p>
             <w:pPr>
@@ -4931,32 +5214,29 @@
               <w:jc w:val="center"/>
             </w:pPr>
             <w:r>
-              <w:rPr>
-                <w:color w:val="000000"/>
-              </w:rPr>
               <w:t>4</w:t>
             </w:r>
           </w:p>
         </w:tc>
         <w:tc>
           <w:tcPr>
-            <w:tcW w:w="2591" w:type="dxa"/>
-          </w:tcPr>
-          <w:p>
-            <w:pPr>
-              <w:spacing w:line="360" w:lineRule="auto"/>
-            </w:pPr>
-            <w:r>
-              <w:rPr>
-                <w:color w:val="000000"/>
-              </w:rPr>
-              <w:t>Hardware Architecture &amp; Design Documentation</w:t>
-            </w:r>
-          </w:p>
-        </w:tc>
-        <w:tc>
-          <w:tcPr>
-            <w:tcW w:w="1198" w:type="dxa"/>
+            <w:tcW w:w="2589" w:type="dxa"/>
+          </w:tcPr>
+          <w:p>
+            <w:pPr>
+              <w:spacing w:line="360" w:lineRule="auto"/>
+            </w:pPr>
+            <w:r>
+              <w:rPr>
+                <w:color w:val="000000"/>
+              </w:rPr>
+              <w:t>Functional Safety Requirements Specification</w:t>
+            </w:r>
+          </w:p>
+        </w:tc>
+        <w:tc>
+          <w:tcPr>
+            <w:tcW w:w="1197" w:type="dxa"/>
           </w:tcPr>
           <w:p>
             <w:pPr>
@@ -4967,29 +5247,24 @@
               <w:rPr>
                 <w:color w:val="000000"/>
               </w:rPr>
-              <w:t>2018</w:t>
-            </w:r>
-          </w:p>
-        </w:tc>
-        <w:tc>
-          <w:tcPr>
-            <w:tcW w:w="1197" w:type="dxa"/>
-          </w:tcPr>
-          <w:p>
-            <w:pPr>
-              <w:spacing w:line="360" w:lineRule="auto"/>
-            </w:pPr>
-            <w:r>
-              <w:rPr>
-                <w:color w:val="000000"/>
-              </w:rPr>
-              <w:t>2026-05-23</w:t>
-            </w:r>
-          </w:p>
-        </w:tc>
-        <w:tc>
-          <w:tcPr>
-            <w:tcW w:w="3844" w:type="dxa"/>
+              <w:t>1</w:t>
+            </w:r>
+          </w:p>
+        </w:tc>
+        <w:tc>
+          <w:tcPr>
+            <w:tcW w:w="1196" w:type="dxa"/>
+          </w:tcPr>
+          <w:p>
+            <w:pPr>
+              <w:spacing w:line="360" w:lineRule="auto"/>
+              <w:jc w:val="center"/>
+            </w:pPr>
+          </w:p>
+        </w:tc>
+        <w:tc>
+          <w:tcPr>
+            <w:tcW w:w="3839" w:type="dxa"/>
           </w:tcPr>
           <w:p>
             <w:pPr>
@@ -5001,7 +5276,7 @@
       <w:tr>
         <w:tc>
           <w:tcPr>
-            <w:tcW w:w="530" w:type="dxa"/>
+            <w:tcW w:w="539" w:type="dxa"/>
           </w:tcPr>
           <w:p>
             <w:pPr>
@@ -5009,66 +5284,50 @@
               <w:jc w:val="center"/>
             </w:pPr>
             <w:r>
-              <w:rPr>
-                <w:color w:val="000000"/>
-              </w:rPr>
               <w:t>5</w:t>
             </w:r>
           </w:p>
         </w:tc>
         <w:tc>
           <w:tcPr>
-            <w:tcW w:w="2591" w:type="dxa"/>
-          </w:tcPr>
-          <w:p>
-            <w:pPr>
-              <w:spacing w:line="360" w:lineRule="auto"/>
-            </w:pPr>
-            <w:r>
-              <w:rPr>
-                <w:color w:val="000000"/>
-              </w:rPr>
-              <w:t>Software Architecture &amp; Source Code</w:t>
-            </w:r>
-          </w:p>
-        </w:tc>
-        <w:tc>
-          <w:tcPr>
-            <w:tcW w:w="1198" w:type="dxa"/>
+            <w:tcW w:w="2589" w:type="dxa"/>
+          </w:tcPr>
+          <w:p>
+            <w:pPr>
+              <w:spacing w:line="360" w:lineRule="auto"/>
+            </w:pPr>
+            <w:r>
+              <w:rPr>
+                <w:color w:val="000000"/>
+              </w:rPr>
+              <w:t>Hardware Architecture &amp; Design Documentation</w:t>
+            </w:r>
+          </w:p>
+        </w:tc>
+        <w:tc>
+          <w:tcPr>
+            <w:tcW w:w="1197" w:type="dxa"/>
           </w:tcPr>
           <w:p>
             <w:pPr>
               <w:spacing w:line="360" w:lineRule="auto"/>
               <w:jc w:val="center"/>
             </w:pPr>
-            <w:r>
-              <w:rPr>
-                <w:color w:val="000000"/>
-              </w:rPr>
-              <w:t>2010</w:t>
-            </w:r>
-          </w:p>
-        </w:tc>
-        <w:tc>
-          <w:tcPr>
-            <w:tcW w:w="1197" w:type="dxa"/>
-          </w:tcPr>
-          <w:p>
-            <w:pPr>
-              <w:spacing w:line="360" w:lineRule="auto"/>
-              <w:jc w:val="center"/>
-            </w:pPr>
-            <w:r>
-              <w:rPr>
-                <w:color w:val="000000"/>
-              </w:rPr>
-              <w:t>2026-05-27</w:t>
-            </w:r>
-          </w:p>
-        </w:tc>
-        <w:tc>
-          <w:tcPr>
-            <w:tcW w:w="3844" w:type="dxa"/>
+          </w:p>
+        </w:tc>
+        <w:tc>
+          <w:tcPr>
+            <w:tcW w:w="1196" w:type="dxa"/>
+          </w:tcPr>
+          <w:p>
+            <w:pPr>
+              <w:spacing w:line="360" w:lineRule="auto"/>
+            </w:pPr>
+          </w:p>
+        </w:tc>
+        <w:tc>
+          <w:tcPr>
+            <w:tcW w:w="3839" w:type="dxa"/>
           </w:tcPr>
           <w:p>
             <w:pPr>
@@ -5080,7 +5339,7 @@
       <w:tr>
         <w:tc>
           <w:tcPr>
-            <w:tcW w:w="530" w:type="dxa"/>
+            <w:tcW w:w="539" w:type="dxa"/>
           </w:tcPr>
           <w:p>
             <w:pPr>
@@ -5088,16 +5347,77 @@
               <w:jc w:val="center"/>
             </w:pPr>
             <w:r>
-              <w:rPr>
-                <w:color w:val="000000"/>
-              </w:rPr>
               <w:t>6</w:t>
             </w:r>
           </w:p>
         </w:tc>
         <w:tc>
           <w:tcPr>
-            <w:tcW w:w="2591" w:type="dxa"/>
+            <w:tcW w:w="2589" w:type="dxa"/>
+          </w:tcPr>
+          <w:p>
+            <w:pPr>
+              <w:spacing w:line="360" w:lineRule="auto"/>
+            </w:pPr>
+            <w:r>
+              <w:rPr>
+                <w:color w:val="000000"/>
+              </w:rPr>
+              <w:t>Software Architecture &amp; Source Code</w:t>
+            </w:r>
+          </w:p>
+        </w:tc>
+        <w:tc>
+          <w:tcPr>
+            <w:tcW w:w="1197" w:type="dxa"/>
+          </w:tcPr>
+          <w:p>
+            <w:pPr>
+              <w:spacing w:line="360" w:lineRule="auto"/>
+              <w:jc w:val="center"/>
+            </w:pPr>
+          </w:p>
+        </w:tc>
+        <w:tc>
+          <w:tcPr>
+            <w:tcW w:w="1196" w:type="dxa"/>
+          </w:tcPr>
+          <w:p>
+            <w:pPr>
+              <w:spacing w:line="360" w:lineRule="auto"/>
+              <w:jc w:val="center"/>
+            </w:pPr>
+          </w:p>
+        </w:tc>
+        <w:tc>
+          <w:tcPr>
+            <w:tcW w:w="3839" w:type="dxa"/>
+          </w:tcPr>
+          <w:p>
+            <w:pPr>
+              <w:spacing w:line="360" w:lineRule="auto"/>
+            </w:pPr>
+          </w:p>
+        </w:tc>
+      </w:tr>
+      <w:tr>
+        <w:tc>
+          <w:tcPr>
+            <w:tcW w:w="539" w:type="dxa"/>
+          </w:tcPr>
+          <w:p>
+            <w:pPr>
+              <w:spacing w:line="360" w:lineRule="auto"/>
+              <w:jc w:val="center"/>
+            </w:pPr>
+            <w:r>
+              <w:t>7</w:t>
+            </w:r>
+          </w:p>
+        </w:tc>
+        <w:tc>
+          <w:tcPr>
+            <w:tcW w:w="2589" w:type="dxa"/>
           </w:tcPr>
           <w:p>
             <w:pPr>
@@ -5113,41 +5433,29 @@
         </w:tc>
         <w:tc>
           <w:tcPr>
-            <w:tcW w:w="1198" w:type="dxa"/>
+            <w:tcW w:w="1197" w:type="dxa"/>
           </w:tcPr>
           <w:p>
             <w:pPr>
               <w:spacing w:line="360" w:lineRule="auto"/>
               <w:jc w:val="center"/>
             </w:pPr>
-            <w:r>
-              <w:rPr>
-                <w:color w:val="000000"/>
-              </w:rPr>
-              <w:t>2013</w:t>
-            </w:r>
-          </w:p>
-        </w:tc>
-        <w:tc>
-          <w:tcPr>
-            <w:tcW w:w="1197" w:type="dxa"/>
+          </w:p>
+        </w:tc>
+        <w:tc>
+          <w:tcPr>
+            <w:tcW w:w="1196" w:type="dxa"/>
           </w:tcPr>
           <w:p>
             <w:pPr>
               <w:spacing w:line="360" w:lineRule="auto"/>
               <w:jc w:val="center"/>
             </w:pPr>
-            <w:r>
-              <w:rPr>
-                <w:color w:val="000000"/>
-              </w:rPr>
-              <w:t>2026-06-07</w:t>
-            </w:r>
-          </w:p>
-        </w:tc>
-        <w:tc>
-          <w:tcPr>
-            <w:tcW w:w="3844" w:type="dxa"/>
+          </w:p>
+        </w:tc>
+        <w:tc>
+          <w:tcPr>
+            <w:tcW w:w="3839" w:type="dxa"/>
           </w:tcPr>
           <w:p>
             <w:pPr>

</xml_diff>

<commit_message>
docs updated: LCP 01, 02, 03
</commit_message>
<xml_diff>
--- a/6. Documentation With Templates/LCP01/LCP01-AIRBAG-ECU-001_Concept_v110.docx
+++ b/6. Documentation With Templates/LCP01/LCP01-AIRBAG-ECU-001_Concept_v110.docx
@@ -2065,15 +2065,7 @@
             </w:r>
             <w:r>
               <w:br/>
-            </w:r>
-            <w:r>
-              <w:t>Mariana Chavez Avila, Mrunal S. Ghotekar,</w:t>
-            </w:r>
-            <w:r>
-              <w:t xml:space="preserve"> </w:t>
-            </w:r>
-            <w:r>
-              <w:t>Om Naik</w:t>
+              <w:t>Mariana Chavez Avila, Mrunal S. Ghotekar, Om Naik</w:t>
             </w:r>
             <w:r>
               <w:t xml:space="preserve">, </w:t>
@@ -4825,10 +4817,10 @@
       </w:tblPr>
       <w:tblGrid>
         <w:gridCol w:w="539"/>
-        <w:gridCol w:w="2358"/>
-        <w:gridCol w:w="1142"/>
-        <w:gridCol w:w="1091"/>
-        <w:gridCol w:w="4230"/>
+        <w:gridCol w:w="2589"/>
+        <w:gridCol w:w="1197"/>
+        <w:gridCol w:w="1196"/>
+        <w:gridCol w:w="3839"/>
       </w:tblGrid>
       <w:tr>
         <w:tc>
@@ -4985,6 +4977,12 @@
               </w:rPr>
               <w:t>1</w:t>
             </w:r>
+            <w:r>
+              <w:rPr>
+                <w:color w:val="000000"/>
+              </w:rPr>
+              <w:t>.1</w:t>
+            </w:r>
           </w:p>
         </w:tc>
         <w:tc>
@@ -5003,7 +5001,13 @@
               <w:rPr>
                 <w:color w:val="000000"/>
               </w:rPr>
-              <w:t>2026-05-02</w:t>
+              <w:t>2026-05-0</w:t>
+            </w:r>
+            <w:r>
+              <w:rPr>
+                <w:color w:val="000000"/>
+              </w:rPr>
+              <w:t>3</w:t>
             </w:r>
           </w:p>
         </w:tc>
@@ -5022,7 +5026,19 @@
               <w:rPr>
                 <w:color w:val="1F3864"/>
               </w:rPr>
-              <w:t>LCP02-AIRBAG-ECU-001_Task_of_the_Process_or_Product_v100</w:t>
+              <w:t>LCP02-AIRBAG-ECU-001_Concept_v_</w:t>
+            </w:r>
+            <w:r>
+              <w:rPr>
+                <w:color w:val="1F3864"/>
+              </w:rPr>
+              <w:t>1</w:t>
+            </w:r>
+            <w:r>
+              <w:rPr>
+                <w:color w:val="1F3864"/>
+              </w:rPr>
+              <w:t>10.docx</w:t>
             </w:r>
           </w:p>
         </w:tc>
@@ -5068,10 +5084,7 @@
               <w:jc w:val="center"/>
             </w:pPr>
             <w:r>
-              <w:rPr>
-                <w:color w:val="000000"/>
-              </w:rPr>
-              <w:t>2</w:t>
+              <w:t>1.1</w:t>
             </w:r>
           </w:p>
         </w:tc>
@@ -5110,7 +5123,19 @@
               <w:rPr>
                 <w:color w:val="1F3864"/>
               </w:rPr>
-              <w:t>LCP03-AIRBAG-ECU-001_HARA_v100</w:t>
+              <w:t>LCP03-AIRBAG-ECU-001_HARA_v1</w:t>
+            </w:r>
+            <w:r>
+              <w:rPr>
+                <w:color w:val="1F3864"/>
+              </w:rPr>
+              <w:t>1</w:t>
+            </w:r>
+            <w:r>
+              <w:rPr>
+                <w:color w:val="1F3864"/>
+              </w:rPr>
+              <w:t>0</w:t>
             </w:r>
           </w:p>
         </w:tc>
@@ -5142,7 +5167,7 @@
               <w:rPr>
                 <w:color w:val="000000"/>
               </w:rPr>
-              <w:t>Safety Concept Document — Airbag ECU</w:t>
+              <w:t>Safety Concept Document</w:t>
             </w:r>
           </w:p>
         </w:tc>
@@ -5182,7 +5207,7 @@
               <w:rPr>
                 <w:color w:val="000000"/>
               </w:rPr>
-              <w:t>10</w:t>
+              <w:t>06</w:t>
             </w:r>
           </w:p>
         </w:tc>
@@ -5198,7 +5223,31 @@
               <w:rPr>
                 <w:color w:val="1F3864"/>
               </w:rPr>
-              <w:t>LCP03-AIRBAG-ECU-001_HARA_v100</w:t>
+              <w:t>LCP0</w:t>
+            </w:r>
+            <w:r>
+              <w:rPr>
+                <w:color w:val="1F3864"/>
+              </w:rPr>
+              <w:t>4</w:t>
+            </w:r>
+            <w:r>
+              <w:rPr>
+                <w:color w:val="1F3864"/>
+              </w:rPr>
+              <w:t>-AIRBAG-ECU-001_HARA_v1</w:t>
+            </w:r>
+            <w:r>
+              <w:rPr>
+                <w:color w:val="1F3864"/>
+              </w:rPr>
+              <w:t>1</w:t>
+            </w:r>
+            <w:r>
+              <w:rPr>
+                <w:color w:val="1F3864"/>
+              </w:rPr>
+              <w:t>0</w:t>
             </w:r>
           </w:p>
         </w:tc>

</xml_diff>

<commit_message>
Doc updated: LCP01 - finalized
</commit_message>
<xml_diff>
--- a/6. Documentation With Templates/LCP01/LCP01-AIRBAG-ECU-001_Concept_v110.docx
+++ b/6. Documentation With Templates/LCP01/LCP01-AIRBAG-ECU-001_Concept_v110.docx
@@ -2,9 +2,10 @@
 <file path=word/document.xml><?xml version="1.0" encoding="utf-8"?>
 <w:document xmlns:wpc="http://schemas.microsoft.com/office/word/2010/wordprocessingCanvas" xmlns:cx="http://schemas.microsoft.com/office/drawing/2014/chartex" xmlns:cx1="http://schemas.microsoft.com/office/drawing/2015/9/8/chartex" xmlns:cx2="http://schemas.microsoft.com/office/drawing/2015/10/21/chartex" xmlns:cx3="http://schemas.microsoft.com/office/drawing/2016/5/9/chartex" xmlns:cx4="http://schemas.microsoft.com/office/drawing/2016/5/10/chartex" xmlns:cx5="http://schemas.microsoft.com/office/drawing/2016/5/11/chartex" xmlns:cx6="http://schemas.microsoft.com/office/drawing/2016/5/12/chartex" xmlns:cx7="http://schemas.microsoft.com/office/drawing/2016/5/13/chartex" xmlns:cx8="http://schemas.microsoft.com/office/drawing/2016/5/14/chartex" xmlns:mc="http://schemas.openxmlformats.org/markup-compatibility/2006" xmlns:aink="http://schemas.microsoft.com/office/drawing/2016/ink" xmlns:am3d="http://schemas.microsoft.com/office/drawing/2017/model3d" xmlns:o="urn:schemas-microsoft-com:office:office" xmlns:oel="http://schemas.microsoft.com/office/2019/extlst" xmlns:r="http://schemas.openxmlformats.org/officeDocument/2006/relationships" xmlns:m="http://schemas.openxmlformats.org/officeDocument/2006/math" xmlns:v="urn:schemas-microsoft-com:vml" xmlns:wp14="http://schemas.microsoft.com/office/word/2010/wordprocessingDrawing" xmlns:wp="http://schemas.openxmlformats.org/drawingml/2006/wordprocessingDrawing" xmlns:w10="urn:schemas-microsoft-com:office:word" xmlns:w="http://schemas.openxmlformats.org/wordprocessingml/2006/main" xmlns:w14="http://schemas.microsoft.com/office/word/2010/wordml" xmlns:w15="http://schemas.microsoft.com/office/word/2012/wordml" xmlns:w16cex="http://schemas.microsoft.com/office/word/2018/wordml/cex" xmlns:w16cid="http://schemas.microsoft.com/office/word/2016/wordml/cid" xmlns:w16="http://schemas.microsoft.com/office/word/2018/wordml" xmlns:w16du="http://schemas.microsoft.com/office/word/2023/wordml/word16du" xmlns:w16sdtdh="http://schemas.microsoft.com/office/word/2020/wordml/sdtdatahash" xmlns:w16sdtfl="http://schemas.microsoft.com/office/word/2024/wordml/sdtformatlock" xmlns:w16se="http://schemas.microsoft.com/office/word/2015/wordml/symex" xmlns:wpg="http://schemas.microsoft.com/office/word/2010/wordprocessingGroup" xmlns:wpi="http://schemas.microsoft.com/office/word/2010/wordprocessingInk" xmlns:wne="http://schemas.microsoft.com/office/word/2006/wordml" xmlns:wps="http://schemas.microsoft.com/office/word/2010/wordprocessingShape" mc:Ignorable="w14 w15 w16se w16cid w16 w16cex w16sdtdh w16sdtfl w16du wp14">
   <w:body>
+    <w:p/>
     <w:tbl>
       <w:tblPr>
-        <w:tblW w:w="9360" w:type="dxa"/>
+        <w:tblW w:w="10101" w:type="dxa"/>
         <w:tblBorders>
           <w:top w:val="single" w:sz="4" w:space="0" w:color="auto"/>
           <w:left w:val="single" w:sz="4" w:space="0" w:color="auto"/>
@@ -20,12 +21,15 @@
         <w:tblLook w:val="04A0" w:firstRow="1" w:lastRow="0" w:firstColumn="1" w:lastColumn="0" w:noHBand="0" w:noVBand="1"/>
       </w:tblPr>
       <w:tblGrid>
-        <w:gridCol w:w="9360"/>
+        <w:gridCol w:w="10101"/>
       </w:tblGrid>
       <w:tr>
-        <w:tc>
-          <w:tcPr>
-            <w:tcW w:w="9360" w:type="dxa"/>
+        <w:trPr>
+          <w:trHeight w:val="2371"/>
+        </w:trPr>
+        <w:tc>
+          <w:tcPr>
+            <w:tcW w:w="10101" w:type="dxa"/>
             <w:tcBorders>
               <w:top w:val="single" w:sz="4" w:space="0" w:color="1F3864"/>
               <w:left w:val="single" w:sz="4" w:space="0" w:color="1F3864"/>
@@ -97,9 +101,12 @@
         </w:tc>
       </w:tr>
       <w:tr>
-        <w:tc>
-          <w:tcPr>
-            <w:tcW w:w="9360" w:type="dxa"/>
+        <w:trPr>
+          <w:trHeight w:val="741"/>
+        </w:trPr>
+        <w:tc>
+          <w:tcPr>
+            <w:tcW w:w="10101" w:type="dxa"/>
             <w:tcBorders>
               <w:top w:val="single" w:sz="4" w:space="0" w:color="2E75B6"/>
               <w:left w:val="single" w:sz="4" w:space="0" w:color="2E75B6"/>
@@ -117,8 +124,6 @@
           <w:p>
             <w:pPr>
               <w:jc w:val="center"/>
-            </w:pPr>
-            <w:r>
               <w:rPr>
                 <w:b/>
                 <w:bCs/>
@@ -126,17 +131,60 @@
                 <w:sz w:val="32"/>
                 <w:szCs w:val="32"/>
               </w:rPr>
-              <w:t>LIFE CYCLE PHASE 1 — CONCEPT</w:t>
+            </w:pPr>
+            <w:r>
+              <w:rPr>
+                <w:b/>
+                <w:bCs/>
+                <w:color w:val="FFFFFF"/>
+                <w:sz w:val="32"/>
+                <w:szCs w:val="32"/>
+              </w:rPr>
+              <w:t xml:space="preserve">LIFE CYCLE PHASE </w:t>
+            </w:r>
+            <w:r>
+              <w:rPr>
+                <w:b/>
+                <w:bCs/>
+                <w:color w:val="FFFFFF"/>
+                <w:sz w:val="32"/>
+                <w:szCs w:val="32"/>
+              </w:rPr>
+              <w:t>1</w:t>
+            </w:r>
+            <w:r>
+              <w:rPr>
+                <w:b/>
+                <w:bCs/>
+                <w:color w:val="FFFFFF"/>
+                <w:sz w:val="32"/>
+                <w:szCs w:val="32"/>
+              </w:rPr>
+              <w:t xml:space="preserve"> </w:t>
+            </w:r>
+          </w:p>
+          <w:p>
+            <w:pPr>
+              <w:jc w:val="center"/>
+            </w:pPr>
+            <w:r>
+              <w:rPr>
+                <w:b/>
+                <w:bCs/>
+                <w:color w:val="FFFFFF"/>
+                <w:sz w:val="32"/>
+                <w:szCs w:val="32"/>
+              </w:rPr>
+              <w:t>CONCEPT</w:t>
             </w:r>
           </w:p>
         </w:tc>
       </w:tr>
     </w:tbl>
     <w:p/>
-    <w:p/>
     <w:tbl>
       <w:tblPr>
-        <w:tblW w:w="9360" w:type="dxa"/>
+        <w:tblW w:w="10094" w:type="dxa"/>
         <w:tblBorders>
           <w:top w:val="single" w:sz="4" w:space="0" w:color="auto"/>
           <w:left w:val="single" w:sz="4" w:space="0" w:color="auto"/>
@@ -152,20 +200,23 @@
         <w:tblLook w:val="04A0" w:firstRow="1" w:lastRow="0" w:firstColumn="1" w:lastColumn="0" w:noHBand="0" w:noVBand="1"/>
       </w:tblPr>
       <w:tblGrid>
-        <w:gridCol w:w="3000"/>
-        <w:gridCol w:w="6360"/>
+        <w:gridCol w:w="3235"/>
+        <w:gridCol w:w="6859"/>
       </w:tblGrid>
       <w:tr>
-        <w:tc>
-          <w:tcPr>
-            <w:tcW w:w="3000" w:type="dxa"/>
+        <w:trPr>
+          <w:trHeight w:val="203"/>
+        </w:trPr>
+        <w:tc>
+          <w:tcPr>
+            <w:tcW w:w="3235" w:type="dxa"/>
             <w:tcBorders>
               <w:top w:val="single" w:sz="4" w:space="0" w:color="BFBFBF"/>
               <w:left w:val="single" w:sz="4" w:space="0" w:color="BFBFBF"/>
               <w:bottom w:val="single" w:sz="4" w:space="0" w:color="BFBFBF"/>
               <w:right w:val="single" w:sz="4" w:space="0" w:color="BFBFBF"/>
             </w:tcBorders>
-            <w:shd w:val="clear" w:color="auto" w:fill="EBF3FB"/>
+            <w:shd w:val="clear" w:color="auto" w:fill="F2F8FD"/>
             <w:tcMar>
               <w:top w:w="70" w:type="dxa"/>
               <w:left w:w="120" w:type="dxa"/>
@@ -188,7 +239,7 @@
         </w:tc>
         <w:tc>
           <w:tcPr>
-            <w:tcW w:w="6360" w:type="dxa"/>
+            <w:tcW w:w="6859" w:type="dxa"/>
             <w:tcBorders>
               <w:top w:val="single" w:sz="4" w:space="0" w:color="BFBFBF"/>
               <w:left w:val="single" w:sz="4" w:space="0" w:color="BFBFBF"/>
@@ -225,16 +276,19 @@
         </w:tc>
       </w:tr>
       <w:tr>
-        <w:tc>
-          <w:tcPr>
-            <w:tcW w:w="3000" w:type="dxa"/>
+        <w:trPr>
+          <w:trHeight w:val="196"/>
+        </w:trPr>
+        <w:tc>
+          <w:tcPr>
+            <w:tcW w:w="3235" w:type="dxa"/>
             <w:tcBorders>
               <w:top w:val="single" w:sz="4" w:space="0" w:color="BFBFBF"/>
               <w:left w:val="single" w:sz="4" w:space="0" w:color="BFBFBF"/>
               <w:bottom w:val="single" w:sz="4" w:space="0" w:color="BFBFBF"/>
               <w:right w:val="single" w:sz="4" w:space="0" w:color="BFBFBF"/>
             </w:tcBorders>
-            <w:shd w:val="clear" w:color="auto" w:fill="EBF3FB"/>
+            <w:shd w:val="clear" w:color="auto" w:fill="F2F8FD"/>
             <w:tcMar>
               <w:top w:w="70" w:type="dxa"/>
               <w:left w:w="120" w:type="dxa"/>
@@ -257,7 +311,7 @@
         </w:tc>
         <w:tc>
           <w:tcPr>
-            <w:tcW w:w="6360" w:type="dxa"/>
+            <w:tcW w:w="6859" w:type="dxa"/>
             <w:tcBorders>
               <w:top w:val="single" w:sz="4" w:space="0" w:color="BFBFBF"/>
               <w:left w:val="single" w:sz="4" w:space="0" w:color="BFBFBF"/>
@@ -286,16 +340,19 @@
         </w:tc>
       </w:tr>
       <w:tr>
-        <w:tc>
-          <w:tcPr>
-            <w:tcW w:w="3000" w:type="dxa"/>
+        <w:trPr>
+          <w:trHeight w:val="203"/>
+        </w:trPr>
+        <w:tc>
+          <w:tcPr>
+            <w:tcW w:w="3235" w:type="dxa"/>
             <w:tcBorders>
               <w:top w:val="single" w:sz="4" w:space="0" w:color="BFBFBF"/>
               <w:left w:val="single" w:sz="4" w:space="0" w:color="BFBFBF"/>
               <w:bottom w:val="single" w:sz="4" w:space="0" w:color="BFBFBF"/>
               <w:right w:val="single" w:sz="4" w:space="0" w:color="BFBFBF"/>
             </w:tcBorders>
-            <w:shd w:val="clear" w:color="auto" w:fill="EBF3FB"/>
+            <w:shd w:val="clear" w:color="auto" w:fill="F2F8FD"/>
             <w:tcMar>
               <w:top w:w="70" w:type="dxa"/>
               <w:left w:w="120" w:type="dxa"/>
@@ -318,7 +375,7 @@
         </w:tc>
         <w:tc>
           <w:tcPr>
-            <w:tcW w:w="6360" w:type="dxa"/>
+            <w:tcW w:w="6859" w:type="dxa"/>
             <w:tcBorders>
               <w:top w:val="single" w:sz="4" w:space="0" w:color="BFBFBF"/>
               <w:left w:val="single" w:sz="4" w:space="0" w:color="BFBFBF"/>
@@ -371,16 +428,19 @@
         </w:tc>
       </w:tr>
       <w:tr>
-        <w:tc>
-          <w:tcPr>
-            <w:tcW w:w="3000" w:type="dxa"/>
+        <w:trPr>
+          <w:trHeight w:val="196"/>
+        </w:trPr>
+        <w:tc>
+          <w:tcPr>
+            <w:tcW w:w="3235" w:type="dxa"/>
             <w:tcBorders>
               <w:top w:val="single" w:sz="4" w:space="0" w:color="BFBFBF"/>
               <w:left w:val="single" w:sz="4" w:space="0" w:color="BFBFBF"/>
               <w:bottom w:val="single" w:sz="4" w:space="0" w:color="BFBFBF"/>
               <w:right w:val="single" w:sz="4" w:space="0" w:color="BFBFBF"/>
             </w:tcBorders>
-            <w:shd w:val="clear" w:color="auto" w:fill="EBF3FB"/>
+            <w:shd w:val="clear" w:color="auto" w:fill="F2F8FD"/>
             <w:tcMar>
               <w:top w:w="70" w:type="dxa"/>
               <w:left w:w="120" w:type="dxa"/>
@@ -413,7 +473,7 @@
         </w:tc>
         <w:tc>
           <w:tcPr>
-            <w:tcW w:w="6360" w:type="dxa"/>
+            <w:tcW w:w="6859" w:type="dxa"/>
             <w:tcBorders>
               <w:top w:val="single" w:sz="4" w:space="0" w:color="BFBFBF"/>
               <w:left w:val="single" w:sz="4" w:space="0" w:color="BFBFBF"/>
@@ -444,56 +504,25 @@
                 <w:sz w:val="18"/>
                 <w:szCs w:val="18"/>
               </w:rPr>
-              <w:t xml:space="preserve">HS Harz </w:t>
-            </w:r>
-            <w:proofErr w:type="spellStart"/>
-            <w:r>
-              <w:rPr>
-                <w:color w:val="000000"/>
-                <w:sz w:val="18"/>
-                <w:szCs w:val="18"/>
-              </w:rPr>
-              <w:t>FuSa</w:t>
-            </w:r>
-            <w:proofErr w:type="spellEnd"/>
-            <w:r>
-              <w:rPr>
-                <w:color w:val="000000"/>
-                <w:sz w:val="18"/>
-                <w:szCs w:val="18"/>
-              </w:rPr>
-              <w:t xml:space="preserve"> — </w:t>
-            </w:r>
-            <w:r>
-              <w:rPr>
-                <w:color w:val="000000"/>
-                <w:sz w:val="18"/>
-                <w:szCs w:val="18"/>
-              </w:rPr>
-              <w:t>Project Management</w:t>
-            </w:r>
-            <w:r>
-              <w:rPr>
-                <w:color w:val="000000"/>
-                <w:sz w:val="18"/>
-                <w:szCs w:val="18"/>
-              </w:rPr>
-              <w:t xml:space="preserve"> Team</w:t>
+              <w:t>Fateme</w:t>
             </w:r>
           </w:p>
         </w:tc>
       </w:tr>
       <w:tr>
-        <w:tc>
-          <w:tcPr>
-            <w:tcW w:w="3000" w:type="dxa"/>
+        <w:trPr>
+          <w:trHeight w:val="203"/>
+        </w:trPr>
+        <w:tc>
+          <w:tcPr>
+            <w:tcW w:w="3235" w:type="dxa"/>
             <w:tcBorders>
               <w:top w:val="single" w:sz="4" w:space="0" w:color="BFBFBF"/>
               <w:left w:val="single" w:sz="4" w:space="0" w:color="BFBFBF"/>
               <w:bottom w:val="single" w:sz="4" w:space="0" w:color="BFBFBF"/>
               <w:right w:val="single" w:sz="4" w:space="0" w:color="BFBFBF"/>
             </w:tcBorders>
-            <w:shd w:val="clear" w:color="auto" w:fill="EBF3FB"/>
+            <w:shd w:val="clear" w:color="auto" w:fill="F2F8FD"/>
             <w:tcMar>
               <w:top w:w="70" w:type="dxa"/>
               <w:left w:w="120" w:type="dxa"/>
@@ -516,7 +545,7 @@
         </w:tc>
         <w:tc>
           <w:tcPr>
-            <w:tcW w:w="6360" w:type="dxa"/>
+            <w:tcW w:w="6859" w:type="dxa"/>
             <w:tcBorders>
               <w:top w:val="single" w:sz="4" w:space="0" w:color="BFBFBF"/>
               <w:left w:val="single" w:sz="4" w:space="0" w:color="BFBFBF"/>
@@ -545,16 +574,19 @@
         </w:tc>
       </w:tr>
       <w:tr>
-        <w:tc>
-          <w:tcPr>
-            <w:tcW w:w="3000" w:type="dxa"/>
+        <w:trPr>
+          <w:trHeight w:val="196"/>
+        </w:trPr>
+        <w:tc>
+          <w:tcPr>
+            <w:tcW w:w="3235" w:type="dxa"/>
             <w:tcBorders>
               <w:top w:val="single" w:sz="4" w:space="0" w:color="BFBFBF"/>
               <w:left w:val="single" w:sz="4" w:space="0" w:color="BFBFBF"/>
               <w:bottom w:val="single" w:sz="4" w:space="0" w:color="BFBFBF"/>
               <w:right w:val="single" w:sz="4" w:space="0" w:color="BFBFBF"/>
             </w:tcBorders>
-            <w:shd w:val="clear" w:color="auto" w:fill="EBF3FB"/>
+            <w:shd w:val="clear" w:color="auto" w:fill="F2F8FD"/>
             <w:tcMar>
               <w:top w:w="70" w:type="dxa"/>
               <w:left w:w="120" w:type="dxa"/>
@@ -577,7 +609,7 @@
         </w:tc>
         <w:tc>
           <w:tcPr>
-            <w:tcW w:w="6360" w:type="dxa"/>
+            <w:tcW w:w="6859" w:type="dxa"/>
             <w:tcBorders>
               <w:top w:val="single" w:sz="4" w:space="0" w:color="BFBFBF"/>
               <w:left w:val="single" w:sz="4" w:space="0" w:color="BFBFBF"/>
@@ -1338,7 +1370,7 @@
                 <w:noProof/>
                 <w:webHidden/>
               </w:rPr>
-              <w:t>8</w:t>
+              <w:t>7</w:t>
             </w:r>
             <w:r>
               <w:rPr>
@@ -1421,7 +1453,7 @@
                 <w:noProof/>
                 <w:webHidden/>
               </w:rPr>
-              <w:t>8</w:t>
+              <w:t>7</w:t>
             </w:r>
             <w:r>
               <w:rPr>
@@ -1504,7 +1536,7 @@
                 <w:noProof/>
                 <w:webHidden/>
               </w:rPr>
-              <w:t>8</w:t>
+              <w:t>7</w:t>
             </w:r>
             <w:r>
               <w:rPr>
@@ -1587,7 +1619,7 @@
                 <w:noProof/>
                 <w:webHidden/>
               </w:rPr>
-              <w:t>9</w:t>
+              <w:t>8</w:t>
             </w:r>
             <w:r>
               <w:rPr>
@@ -1670,7 +1702,7 @@
                 <w:noProof/>
                 <w:webHidden/>
               </w:rPr>
-              <w:t>10</w:t>
+              <w:t>9</w:t>
             </w:r>
             <w:r>
               <w:rPr>
@@ -1753,7 +1785,7 @@
                 <w:noProof/>
                 <w:webHidden/>
               </w:rPr>
-              <w:t>11</w:t>
+              <w:t>10</w:t>
             </w:r>
             <w:r>
               <w:rPr>
@@ -1836,7 +1868,7 @@
                 <w:noProof/>
                 <w:webHidden/>
               </w:rPr>
-              <w:t>12</w:t>
+              <w:t>11</w:t>
             </w:r>
             <w:r>
               <w:rPr>
@@ -1892,7 +1924,7 @@
         <w:pStyle w:val="Caption"/>
         <w:keepNext/>
       </w:pPr>
-      <w:bookmarkStart w:id="1" w:name="_Toc231936653"/>
+      <w:bookmarkStart w:id="1" w:name="_Toc232167492"/>
       <w:r>
         <w:t xml:space="preserve">Table </w:t>
       </w:r>
@@ -1925,17 +1957,21 @@
         <w:tc>
           <w:tcPr>
             <w:tcW w:w="2302" w:type="dxa"/>
+            <w:shd w:val="clear" w:color="auto" w:fill="1F3864"/>
           </w:tcPr>
           <w:p>
             <w:pPr>
               <w:spacing w:line="360" w:lineRule="auto"/>
               <w:jc w:val="center"/>
+              <w:rPr>
+                <w:color w:val="FFFFFF" w:themeColor="background1"/>
+              </w:rPr>
             </w:pPr>
             <w:r>
               <w:rPr>
                 <w:b/>
                 <w:bCs/>
-                <w:color w:val="1F3864"/>
+                <w:color w:val="FFFFFF" w:themeColor="background1"/>
               </w:rPr>
               <w:t>Topic</w:t>
             </w:r>
@@ -1944,17 +1980,21 @@
         <w:tc>
           <w:tcPr>
             <w:tcW w:w="1379" w:type="dxa"/>
+            <w:shd w:val="clear" w:color="auto" w:fill="1F3864"/>
           </w:tcPr>
           <w:p>
             <w:pPr>
               <w:spacing w:line="360" w:lineRule="auto"/>
               <w:jc w:val="center"/>
+              <w:rPr>
+                <w:color w:val="FFFFFF" w:themeColor="background1"/>
+              </w:rPr>
             </w:pPr>
             <w:r>
               <w:rPr>
                 <w:b/>
                 <w:bCs/>
-                <w:color w:val="1F3864"/>
+                <w:color w:val="FFFFFF" w:themeColor="background1"/>
               </w:rPr>
               <w:t>Date / Time</w:t>
             </w:r>
@@ -1963,17 +2003,21 @@
         <w:tc>
           <w:tcPr>
             <w:tcW w:w="2410" w:type="dxa"/>
+            <w:shd w:val="clear" w:color="auto" w:fill="1F3864"/>
           </w:tcPr>
           <w:p>
             <w:pPr>
               <w:spacing w:line="360" w:lineRule="auto"/>
               <w:jc w:val="center"/>
+              <w:rPr>
+                <w:color w:val="FFFFFF" w:themeColor="background1"/>
+              </w:rPr>
             </w:pPr>
             <w:r>
               <w:rPr>
                 <w:b/>
                 <w:bCs/>
-                <w:color w:val="1F3864"/>
+                <w:color w:val="FFFFFF" w:themeColor="background1"/>
               </w:rPr>
               <w:t>Participants</w:t>
             </w:r>
@@ -1982,6 +2026,7 @@
         <w:tc>
           <w:tcPr>
             <w:tcW w:w="3979" w:type="dxa"/>
+            <w:shd w:val="clear" w:color="auto" w:fill="1F3864"/>
           </w:tcPr>
           <w:p>
             <w:pPr>
@@ -1992,14 +2037,14 @@
               <w:rPr>
                 <w:b/>
                 <w:bCs/>
-                <w:color w:val="1F3864"/>
+                <w:color w:val="FFFFFF" w:themeColor="background1"/>
               </w:rPr>
             </w:pPr>
             <w:r>
               <w:rPr>
                 <w:b/>
                 <w:bCs/>
-                <w:color w:val="1F3864"/>
+                <w:color w:val="FFFFFF" w:themeColor="background1"/>
               </w:rPr>
               <w:tab/>
               <w:t>Minutes / Decisions</w:t>
@@ -2111,6 +2156,7 @@
         <w:tc>
           <w:tcPr>
             <w:tcW w:w="2302" w:type="dxa"/>
+            <w:shd w:val="clear" w:color="auto" w:fill="F2F8FD"/>
           </w:tcPr>
           <w:p>
             <w:pPr>
@@ -2130,6 +2176,7 @@
         <w:tc>
           <w:tcPr>
             <w:tcW w:w="1379" w:type="dxa"/>
+            <w:shd w:val="clear" w:color="auto" w:fill="F2F8FD"/>
           </w:tcPr>
           <w:p>
             <w:pPr>
@@ -2164,6 +2211,7 @@
         <w:tc>
           <w:tcPr>
             <w:tcW w:w="2410" w:type="dxa"/>
+            <w:shd w:val="clear" w:color="auto" w:fill="F2F8FD"/>
           </w:tcPr>
           <w:p>
             <w:pPr>
@@ -2236,6 +2284,7 @@
         <w:tc>
           <w:tcPr>
             <w:tcW w:w="3979" w:type="dxa"/>
+            <w:shd w:val="clear" w:color="auto" w:fill="F2F8FD"/>
           </w:tcPr>
           <w:p>
             <w:pPr>
@@ -2307,7 +2356,7 @@
         <w:pStyle w:val="Caption"/>
         <w:keepNext/>
       </w:pPr>
-      <w:bookmarkStart w:id="4" w:name="_Toc231936654"/>
+      <w:bookmarkStart w:id="4" w:name="_Toc232167493"/>
       <w:r>
         <w:t xml:space="preserve">Table </w:t>
       </w:r>
@@ -2327,28 +2376,35 @@
     <w:tbl>
       <w:tblPr>
         <w:tblStyle w:val="TestStyle1"/>
-        <w:tblW w:w="8760" w:type="dxa"/>
+        <w:tblW w:w="10019" w:type="dxa"/>
         <w:tblLook w:val="04A0" w:firstRow="1" w:lastRow="0" w:firstColumn="1" w:lastColumn="0" w:noHBand="0" w:noVBand="1"/>
       </w:tblPr>
       <w:tblGrid>
-        <w:gridCol w:w="2200"/>
-        <w:gridCol w:w="6560"/>
+        <w:gridCol w:w="2516"/>
+        <w:gridCol w:w="7503"/>
       </w:tblGrid>
       <w:tr>
-        <w:tc>
-          <w:tcPr>
-            <w:tcW w:w="2200" w:type="dxa"/>
+        <w:trPr>
+          <w:trHeight w:val="344"/>
+        </w:trPr>
+        <w:tc>
+          <w:tcPr>
+            <w:tcW w:w="2516" w:type="dxa"/>
+            <w:shd w:val="clear" w:color="auto" w:fill="1F3864"/>
           </w:tcPr>
           <w:p>
             <w:pPr>
               <w:spacing w:line="360" w:lineRule="auto"/>
               <w:jc w:val="center"/>
+              <w:rPr>
+                <w:color w:val="FFFFFF" w:themeColor="background1"/>
+              </w:rPr>
             </w:pPr>
             <w:r>
               <w:rPr>
                 <w:b/>
                 <w:bCs/>
-                <w:color w:val="1F3864"/>
+                <w:color w:val="FFFFFF" w:themeColor="background1"/>
               </w:rPr>
               <w:t>Term / Abbreviation</w:t>
             </w:r>
@@ -2356,18 +2412,22 @@
         </w:tc>
         <w:tc>
           <w:tcPr>
-            <w:tcW w:w="6560" w:type="dxa"/>
+            <w:tcW w:w="7503" w:type="dxa"/>
+            <w:shd w:val="clear" w:color="auto" w:fill="1F3864"/>
           </w:tcPr>
           <w:p>
             <w:pPr>
               <w:spacing w:line="360" w:lineRule="auto"/>
               <w:jc w:val="center"/>
+              <w:rPr>
+                <w:color w:val="FFFFFF" w:themeColor="background1"/>
+              </w:rPr>
             </w:pPr>
             <w:r>
               <w:rPr>
                 <w:b/>
                 <w:bCs/>
-                <w:color w:val="1F3864"/>
+                <w:color w:val="FFFFFF" w:themeColor="background1"/>
               </w:rPr>
               <w:t>Definition</w:t>
             </w:r>
@@ -2375,9 +2435,12 @@
         </w:tc>
       </w:tr>
       <w:tr>
-        <w:tc>
-          <w:tcPr>
-            <w:tcW w:w="2200" w:type="dxa"/>
+        <w:trPr>
+          <w:trHeight w:val="697"/>
+        </w:trPr>
+        <w:tc>
+          <w:tcPr>
+            <w:tcW w:w="2516" w:type="dxa"/>
           </w:tcPr>
           <w:p>
             <w:pPr>
@@ -2395,7 +2458,7 @@
         </w:tc>
         <w:tc>
           <w:tcPr>
-            <w:tcW w:w="6560" w:type="dxa"/>
+            <w:tcW w:w="7503" w:type="dxa"/>
           </w:tcPr>
           <w:p>
             <w:pPr>
@@ -2411,9 +2474,13 @@
         </w:tc>
       </w:tr>
       <w:tr>
-        <w:tc>
-          <w:tcPr>
-            <w:tcW w:w="2200" w:type="dxa"/>
+        <w:trPr>
+          <w:trHeight w:val="344"/>
+        </w:trPr>
+        <w:tc>
+          <w:tcPr>
+            <w:tcW w:w="2516" w:type="dxa"/>
+            <w:shd w:val="clear" w:color="auto" w:fill="F2F8FD"/>
           </w:tcPr>
           <w:p>
             <w:pPr>
@@ -2431,7 +2498,8 @@
         </w:tc>
         <w:tc>
           <w:tcPr>
-            <w:tcW w:w="6560" w:type="dxa"/>
+            <w:tcW w:w="7503" w:type="dxa"/>
+            <w:shd w:val="clear" w:color="auto" w:fill="F2F8FD"/>
           </w:tcPr>
           <w:p>
             <w:pPr>
@@ -2447,9 +2515,12 @@
         </w:tc>
       </w:tr>
       <w:tr>
-        <w:tc>
-          <w:tcPr>
-            <w:tcW w:w="2200" w:type="dxa"/>
+        <w:trPr>
+          <w:trHeight w:val="344"/>
+        </w:trPr>
+        <w:tc>
+          <w:tcPr>
+            <w:tcW w:w="2516" w:type="dxa"/>
           </w:tcPr>
           <w:p>
             <w:pPr>
@@ -2467,7 +2538,7 @@
         </w:tc>
         <w:tc>
           <w:tcPr>
-            <w:tcW w:w="6560" w:type="dxa"/>
+            <w:tcW w:w="7503" w:type="dxa"/>
           </w:tcPr>
           <w:p>
             <w:pPr>
@@ -2483,9 +2554,13 @@
         </w:tc>
       </w:tr>
       <w:tr>
-        <w:tc>
-          <w:tcPr>
-            <w:tcW w:w="2200" w:type="dxa"/>
+        <w:trPr>
+          <w:trHeight w:val="352"/>
+        </w:trPr>
+        <w:tc>
+          <w:tcPr>
+            <w:tcW w:w="2516" w:type="dxa"/>
+            <w:shd w:val="clear" w:color="auto" w:fill="F2F8FD"/>
           </w:tcPr>
           <w:p>
             <w:pPr>
@@ -2503,7 +2578,8 @@
         </w:tc>
         <w:tc>
           <w:tcPr>
-            <w:tcW w:w="6560" w:type="dxa"/>
+            <w:tcW w:w="7503" w:type="dxa"/>
+            <w:shd w:val="clear" w:color="auto" w:fill="F2F8FD"/>
           </w:tcPr>
           <w:p>
             <w:pPr>
@@ -2519,9 +2595,12 @@
         </w:tc>
       </w:tr>
       <w:tr>
-        <w:tc>
-          <w:tcPr>
-            <w:tcW w:w="2200" w:type="dxa"/>
+        <w:trPr>
+          <w:trHeight w:val="344"/>
+        </w:trPr>
+        <w:tc>
+          <w:tcPr>
+            <w:tcW w:w="2516" w:type="dxa"/>
           </w:tcPr>
           <w:p>
             <w:pPr>
@@ -2539,7 +2618,7 @@
         </w:tc>
         <w:tc>
           <w:tcPr>
-            <w:tcW w:w="6560" w:type="dxa"/>
+            <w:tcW w:w="7503" w:type="dxa"/>
           </w:tcPr>
           <w:p>
             <w:pPr>
@@ -2555,9 +2634,13 @@
         </w:tc>
       </w:tr>
       <w:tr>
-        <w:tc>
-          <w:tcPr>
-            <w:tcW w:w="2200" w:type="dxa"/>
+        <w:trPr>
+          <w:trHeight w:val="344"/>
+        </w:trPr>
+        <w:tc>
+          <w:tcPr>
+            <w:tcW w:w="2516" w:type="dxa"/>
+            <w:shd w:val="clear" w:color="auto" w:fill="F2F8FD"/>
           </w:tcPr>
           <w:p>
             <w:pPr>
@@ -2575,7 +2658,8 @@
         </w:tc>
         <w:tc>
           <w:tcPr>
-            <w:tcW w:w="6560" w:type="dxa"/>
+            <w:tcW w:w="7503" w:type="dxa"/>
+            <w:shd w:val="clear" w:color="auto" w:fill="F2F8FD"/>
           </w:tcPr>
           <w:p>
             <w:pPr>
@@ -2591,9 +2675,12 @@
         </w:tc>
       </w:tr>
       <w:tr>
-        <w:tc>
-          <w:tcPr>
-            <w:tcW w:w="2200" w:type="dxa"/>
+        <w:trPr>
+          <w:trHeight w:val="352"/>
+        </w:trPr>
+        <w:tc>
+          <w:tcPr>
+            <w:tcW w:w="2516" w:type="dxa"/>
           </w:tcPr>
           <w:p>
             <w:pPr>
@@ -2611,7 +2698,7 @@
         </w:tc>
         <w:tc>
           <w:tcPr>
-            <w:tcW w:w="6560" w:type="dxa"/>
+            <w:tcW w:w="7503" w:type="dxa"/>
           </w:tcPr>
           <w:p>
             <w:pPr>
@@ -2627,9 +2714,13 @@
         </w:tc>
       </w:tr>
       <w:tr>
-        <w:tc>
-          <w:tcPr>
-            <w:tcW w:w="2200" w:type="dxa"/>
+        <w:trPr>
+          <w:trHeight w:val="344"/>
+        </w:trPr>
+        <w:tc>
+          <w:tcPr>
+            <w:tcW w:w="2516" w:type="dxa"/>
+            <w:shd w:val="clear" w:color="auto" w:fill="F2F8FD"/>
           </w:tcPr>
           <w:p>
             <w:pPr>
@@ -2647,7 +2738,8 @@
         </w:tc>
         <w:tc>
           <w:tcPr>
-            <w:tcW w:w="6560" w:type="dxa"/>
+            <w:tcW w:w="7503" w:type="dxa"/>
+            <w:shd w:val="clear" w:color="auto" w:fill="F2F8FD"/>
           </w:tcPr>
           <w:p>
             <w:pPr>
@@ -2663,9 +2755,12 @@
         </w:tc>
       </w:tr>
       <w:tr>
-        <w:tc>
-          <w:tcPr>
-            <w:tcW w:w="2200" w:type="dxa"/>
+        <w:trPr>
+          <w:trHeight w:val="344"/>
+        </w:trPr>
+        <w:tc>
+          <w:tcPr>
+            <w:tcW w:w="2516" w:type="dxa"/>
           </w:tcPr>
           <w:p>
             <w:pPr>
@@ -2683,7 +2778,7 @@
         </w:tc>
         <w:tc>
           <w:tcPr>
-            <w:tcW w:w="6560" w:type="dxa"/>
+            <w:tcW w:w="7503" w:type="dxa"/>
           </w:tcPr>
           <w:p>
             <w:pPr>
@@ -2699,9 +2794,13 @@
         </w:tc>
       </w:tr>
       <w:tr>
-        <w:tc>
-          <w:tcPr>
-            <w:tcW w:w="2200" w:type="dxa"/>
+        <w:trPr>
+          <w:trHeight w:val="352"/>
+        </w:trPr>
+        <w:tc>
+          <w:tcPr>
+            <w:tcW w:w="2516" w:type="dxa"/>
+            <w:shd w:val="clear" w:color="auto" w:fill="F2F8FD"/>
           </w:tcPr>
           <w:p>
             <w:pPr>
@@ -2719,7 +2818,8 @@
         </w:tc>
         <w:tc>
           <w:tcPr>
-            <w:tcW w:w="6560" w:type="dxa"/>
+            <w:tcW w:w="7503" w:type="dxa"/>
+            <w:shd w:val="clear" w:color="auto" w:fill="F2F8FD"/>
           </w:tcPr>
           <w:p>
             <w:pPr>
@@ -2735,9 +2835,12 @@
         </w:tc>
       </w:tr>
       <w:tr>
-        <w:tc>
-          <w:tcPr>
-            <w:tcW w:w="2200" w:type="dxa"/>
+        <w:trPr>
+          <w:trHeight w:val="344"/>
+        </w:trPr>
+        <w:tc>
+          <w:tcPr>
+            <w:tcW w:w="2516" w:type="dxa"/>
           </w:tcPr>
           <w:p>
             <w:pPr>
@@ -2755,7 +2858,7 @@
         </w:tc>
         <w:tc>
           <w:tcPr>
-            <w:tcW w:w="6560" w:type="dxa"/>
+            <w:tcW w:w="7503" w:type="dxa"/>
           </w:tcPr>
           <w:p>
             <w:pPr>
@@ -2771,9 +2874,13 @@
         </w:tc>
       </w:tr>
       <w:tr>
-        <w:tc>
-          <w:tcPr>
-            <w:tcW w:w="2200" w:type="dxa"/>
+        <w:trPr>
+          <w:trHeight w:val="689"/>
+        </w:trPr>
+        <w:tc>
+          <w:tcPr>
+            <w:tcW w:w="2516" w:type="dxa"/>
+            <w:shd w:val="clear" w:color="auto" w:fill="F2F8FD"/>
           </w:tcPr>
           <w:p>
             <w:pPr>
@@ -2791,7 +2898,8 @@
         </w:tc>
         <w:tc>
           <w:tcPr>
-            <w:tcW w:w="6560" w:type="dxa"/>
+            <w:tcW w:w="7503" w:type="dxa"/>
+            <w:shd w:val="clear" w:color="auto" w:fill="F2F8FD"/>
           </w:tcPr>
           <w:p>
             <w:pPr>
@@ -2807,9 +2915,12 @@
         </w:tc>
       </w:tr>
       <w:tr>
-        <w:tc>
-          <w:tcPr>
-            <w:tcW w:w="2200" w:type="dxa"/>
+        <w:trPr>
+          <w:trHeight w:val="352"/>
+        </w:trPr>
+        <w:tc>
+          <w:tcPr>
+            <w:tcW w:w="2516" w:type="dxa"/>
           </w:tcPr>
           <w:p>
             <w:pPr>
@@ -2827,7 +2938,7 @@
         </w:tc>
         <w:tc>
           <w:tcPr>
-            <w:tcW w:w="6560" w:type="dxa"/>
+            <w:tcW w:w="7503" w:type="dxa"/>
           </w:tcPr>
           <w:p>
             <w:pPr>
@@ -2843,9 +2954,13 @@
         </w:tc>
       </w:tr>
       <w:tr>
-        <w:tc>
-          <w:tcPr>
-            <w:tcW w:w="2200" w:type="dxa"/>
+        <w:trPr>
+          <w:trHeight w:val="344"/>
+        </w:trPr>
+        <w:tc>
+          <w:tcPr>
+            <w:tcW w:w="2516" w:type="dxa"/>
+            <w:shd w:val="clear" w:color="auto" w:fill="F2F8FD"/>
           </w:tcPr>
           <w:p>
             <w:pPr>
@@ -2863,7 +2978,8 @@
         </w:tc>
         <w:tc>
           <w:tcPr>
-            <w:tcW w:w="6560" w:type="dxa"/>
+            <w:tcW w:w="7503" w:type="dxa"/>
+            <w:shd w:val="clear" w:color="auto" w:fill="F2F8FD"/>
           </w:tcPr>
           <w:p>
             <w:pPr>
@@ -2879,9 +2995,12 @@
         </w:tc>
       </w:tr>
       <w:tr>
-        <w:tc>
-          <w:tcPr>
-            <w:tcW w:w="2200" w:type="dxa"/>
+        <w:trPr>
+          <w:trHeight w:val="352"/>
+        </w:trPr>
+        <w:tc>
+          <w:tcPr>
+            <w:tcW w:w="2516" w:type="dxa"/>
           </w:tcPr>
           <w:p>
             <w:pPr>
@@ -2899,7 +3018,7 @@
         </w:tc>
         <w:tc>
           <w:tcPr>
-            <w:tcW w:w="6560" w:type="dxa"/>
+            <w:tcW w:w="7503" w:type="dxa"/>
           </w:tcPr>
           <w:p>
             <w:pPr>
@@ -2929,6 +3048,9 @@
       <w:bookmarkEnd w:id="5"/>
     </w:p>
     <w:p>
+      <w:pPr>
+        <w:jc w:val="both"/>
+      </w:pPr>
       <w:r>
         <w:t xml:space="preserve">This document establishes the initial Concept of operation and safety for an automotive Airbag Electronic Control Unit (ECU). Developed under the strict structural lifecycle guidelines of the IEC 61508 standard, this project incorporates risk-oriented architecture designs to systematically avoid human design errors (via rigorous QM) and control random hardware structural failures. </w:t>
       </w:r>
@@ -3064,7 +3186,7 @@
         <w:pStyle w:val="Caption"/>
         <w:keepNext/>
       </w:pPr>
-      <w:bookmarkStart w:id="9" w:name="_Toc231936655"/>
+      <w:bookmarkStart w:id="9" w:name="_Toc232167494"/>
       <w:r>
         <w:t xml:space="preserve">Table </w:t>
       </w:r>
@@ -3095,6 +3217,7 @@
         <w:tc>
           <w:tcPr>
             <w:tcW w:w="0" w:type="auto"/>
+            <w:shd w:val="clear" w:color="auto" w:fill="1F3864"/>
             <w:vAlign w:val="center"/>
             <w:hideMark/>
           </w:tcPr>
@@ -3106,7 +3229,7 @@
                 <w:rFonts w:eastAsia="Times New Roman"/>
                 <w:b/>
                 <w:bCs/>
-                <w:color w:val="1F2328"/>
+                <w:color w:val="FFFFFF" w:themeColor="background1"/>
               </w:rPr>
             </w:pPr>
             <w:r>
@@ -3114,12 +3237,43 @@
                 <w:rFonts w:eastAsia="Times New Roman"/>
                 <w:b/>
                 <w:bCs/>
-                <w:color w:val="1F2328"/>
+                <w:color w:val="FFFFFF" w:themeColor="background1"/>
               </w:rPr>
               <w:t>Role</w:t>
             </w:r>
           </w:p>
         </w:tc>
+        <w:tc>
+          <w:tcPr>
+            <w:tcW w:w="0" w:type="auto"/>
+            <w:shd w:val="clear" w:color="auto" w:fill="1F3864"/>
+            <w:vAlign w:val="center"/>
+            <w:hideMark/>
+          </w:tcPr>
+          <w:p>
+            <w:pPr>
+              <w:spacing w:after="240" w:line="360" w:lineRule="auto"/>
+              <w:jc w:val="center"/>
+              <w:rPr>
+                <w:rFonts w:eastAsia="Times New Roman"/>
+                <w:b/>
+                <w:bCs/>
+                <w:color w:val="FFFFFF" w:themeColor="background1"/>
+              </w:rPr>
+            </w:pPr>
+            <w:r>
+              <w:rPr>
+                <w:rFonts w:eastAsia="Times New Roman"/>
+                <w:b/>
+                <w:bCs/>
+                <w:color w:val="FFFFFF" w:themeColor="background1"/>
+              </w:rPr>
+              <w:t>Name</w:t>
+            </w:r>
+          </w:p>
+        </w:tc>
+      </w:tr>
+      <w:tr>
         <w:tc>
           <w:tcPr>
             <w:tcW w:w="0" w:type="auto"/>
@@ -3128,28 +3282,21 @@
           </w:tcPr>
           <w:p>
             <w:pPr>
-              <w:spacing w:after="240" w:line="360" w:lineRule="auto"/>
-              <w:jc w:val="center"/>
+              <w:spacing w:line="360" w:lineRule="auto"/>
               <w:rPr>
                 <w:rFonts w:eastAsia="Times New Roman"/>
-                <w:b/>
-                <w:bCs/>
                 <w:color w:val="1F2328"/>
               </w:rPr>
             </w:pPr>
             <w:r>
               <w:rPr>
                 <w:rFonts w:eastAsia="Times New Roman"/>
-                <w:b/>
-                <w:bCs/>
                 <w:color w:val="1F2328"/>
               </w:rPr>
-              <w:t>Name</w:t>
-            </w:r>
-          </w:p>
-        </w:tc>
-      </w:tr>
-      <w:tr>
+              <w:t>Project Manager</w:t>
+            </w:r>
+          </w:p>
+        </w:tc>
         <w:tc>
           <w:tcPr>
             <w:tcW w:w="0" w:type="auto"/>
@@ -3169,13 +3316,16 @@
                 <w:rFonts w:eastAsia="Times New Roman"/>
                 <w:color w:val="1F2328"/>
               </w:rPr>
-              <w:t>Project Manager</w:t>
-            </w:r>
-          </w:p>
-        </w:tc>
+              <w:t>Alita Shrestha</w:t>
+            </w:r>
+          </w:p>
+        </w:tc>
+      </w:tr>
+      <w:tr>
         <w:tc>
           <w:tcPr>
             <w:tcW w:w="0" w:type="auto"/>
+            <w:shd w:val="clear" w:color="auto" w:fill="F2F8FD"/>
             <w:vAlign w:val="center"/>
             <w:hideMark/>
           </w:tcPr>
@@ -3192,38 +3342,14 @@
                 <w:rFonts w:eastAsia="Times New Roman"/>
                 <w:color w:val="1F2328"/>
               </w:rPr>
-              <w:t>Alita Shrestha</w:t>
-            </w:r>
-          </w:p>
-        </w:tc>
-      </w:tr>
-      <w:tr>
+              <w:t>Functional Safety Manager</w:t>
+            </w:r>
+          </w:p>
+        </w:tc>
         <w:tc>
           <w:tcPr>
             <w:tcW w:w="0" w:type="auto"/>
-            <w:vAlign w:val="center"/>
-            <w:hideMark/>
-          </w:tcPr>
-          <w:p>
-            <w:pPr>
-              <w:spacing w:line="360" w:lineRule="auto"/>
-              <w:rPr>
-                <w:rFonts w:eastAsia="Times New Roman"/>
-                <w:color w:val="1F2328"/>
-              </w:rPr>
-            </w:pPr>
-            <w:r>
-              <w:rPr>
-                <w:rFonts w:eastAsia="Times New Roman"/>
-                <w:color w:val="1F2328"/>
-              </w:rPr>
-              <w:t>Functional Safety Manager</w:t>
-            </w:r>
-          </w:p>
-        </w:tc>
-        <w:tc>
-          <w:tcPr>
-            <w:tcW w:w="0" w:type="auto"/>
+            <w:shd w:val="clear" w:color="auto" w:fill="F2F8FD"/>
             <w:vAlign w:val="center"/>
             <w:hideMark/>
           </w:tcPr>
@@ -3300,6 +3426,7 @@
         <w:tc>
           <w:tcPr>
             <w:tcW w:w="0" w:type="auto"/>
+            <w:shd w:val="clear" w:color="auto" w:fill="F2F8FD"/>
             <w:vAlign w:val="center"/>
             <w:hideMark/>
           </w:tcPr>
@@ -3320,6 +3447,41 @@
             </w:r>
           </w:p>
         </w:tc>
+        <w:tc>
+          <w:tcPr>
+            <w:tcW w:w="0" w:type="auto"/>
+            <w:shd w:val="clear" w:color="auto" w:fill="F2F8FD"/>
+            <w:vAlign w:val="center"/>
+            <w:hideMark/>
+          </w:tcPr>
+          <w:p>
+            <w:pPr>
+              <w:spacing w:line="360" w:lineRule="auto"/>
+              <w:rPr>
+                <w:rFonts w:eastAsia="Times New Roman"/>
+                <w:color w:val="1F2328"/>
+              </w:rPr>
+            </w:pPr>
+            <w:r>
+              <w:rPr>
+                <w:rFonts w:eastAsia="Times New Roman"/>
+                <w:color w:val="1F2328"/>
+              </w:rPr>
+              <w:t xml:space="preserve">Mobina </w:t>
+            </w:r>
+            <w:proofErr w:type="spellStart"/>
+            <w:r>
+              <w:rPr>
+                <w:rFonts w:eastAsia="Times New Roman"/>
+                <w:color w:val="1F2328"/>
+              </w:rPr>
+              <w:t>Ketabi</w:t>
+            </w:r>
+            <w:proofErr w:type="spellEnd"/>
+          </w:p>
+        </w:tc>
+      </w:tr>
+      <w:tr>
         <w:tc>
           <w:tcPr>
             <w:tcW w:w="0" w:type="auto"/>
@@ -3339,21 +3501,10 @@
                 <w:rFonts w:eastAsia="Times New Roman"/>
                 <w:color w:val="1F2328"/>
               </w:rPr>
-              <w:t xml:space="preserve">Mobina </w:t>
-            </w:r>
-            <w:proofErr w:type="spellStart"/>
-            <w:r>
-              <w:rPr>
-                <w:rFonts w:eastAsia="Times New Roman"/>
-                <w:color w:val="1F2328"/>
-              </w:rPr>
-              <w:t>Ketabi</w:t>
-            </w:r>
-            <w:proofErr w:type="spellEnd"/>
-          </w:p>
-        </w:tc>
-      </w:tr>
-      <w:tr>
+              <w:t>Software Architect</w:t>
+            </w:r>
+          </w:p>
+        </w:tc>
         <w:tc>
           <w:tcPr>
             <w:tcW w:w="0" w:type="auto"/>
@@ -3373,10 +3524,78 @@
                 <w:rFonts w:eastAsia="Times New Roman"/>
                 <w:color w:val="1F2328"/>
               </w:rPr>
-              <w:t>Software Architect</w:t>
-            </w:r>
-          </w:p>
-        </w:tc>
+              <w:t>Mariana Chavez Avila</w:t>
+            </w:r>
+          </w:p>
+        </w:tc>
+      </w:tr>
+      <w:tr>
+        <w:tc>
+          <w:tcPr>
+            <w:tcW w:w="0" w:type="auto"/>
+            <w:shd w:val="clear" w:color="auto" w:fill="F2F8FD"/>
+            <w:vAlign w:val="center"/>
+            <w:hideMark/>
+          </w:tcPr>
+          <w:p>
+            <w:pPr>
+              <w:spacing w:line="360" w:lineRule="auto"/>
+              <w:rPr>
+                <w:rFonts w:eastAsia="Times New Roman"/>
+                <w:color w:val="1F2328"/>
+              </w:rPr>
+            </w:pPr>
+            <w:r>
+              <w:rPr>
+                <w:rFonts w:eastAsia="Times New Roman"/>
+                <w:color w:val="1F2328"/>
+              </w:rPr>
+              <w:t>Software Engineer</w:t>
+            </w:r>
+          </w:p>
+        </w:tc>
+        <w:tc>
+          <w:tcPr>
+            <w:tcW w:w="0" w:type="auto"/>
+            <w:shd w:val="clear" w:color="auto" w:fill="F2F8FD"/>
+            <w:vAlign w:val="center"/>
+            <w:hideMark/>
+          </w:tcPr>
+          <w:p>
+            <w:pPr>
+              <w:spacing w:line="360" w:lineRule="auto"/>
+              <w:rPr>
+                <w:rFonts w:eastAsia="Times New Roman"/>
+                <w:color w:val="1F2328"/>
+              </w:rPr>
+            </w:pPr>
+            <w:r>
+              <w:rPr>
+                <w:rFonts w:eastAsia="Times New Roman"/>
+                <w:color w:val="1F2328"/>
+              </w:rPr>
+              <w:t xml:space="preserve">Mrunal </w:t>
+            </w:r>
+            <w:proofErr w:type="spellStart"/>
+            <w:r>
+              <w:rPr>
+                <w:rFonts w:eastAsia="Times New Roman"/>
+                <w:color w:val="1F2328"/>
+              </w:rPr>
+              <w:t>Sahebrao</w:t>
+            </w:r>
+            <w:proofErr w:type="spellEnd"/>
+            <w:r>
+              <w:rPr>
+                <w:rFonts w:eastAsia="Times New Roman"/>
+                <w:color w:val="1F2328"/>
+              </w:rPr>
+              <w:t xml:space="preserve"> Ghotekar</w:t>
+            </w:r>
+          </w:p>
+        </w:tc>
+      </w:tr>
+      <w:tr>
         <w:tc>
           <w:tcPr>
             <w:tcW w:w="0" w:type="auto"/>
@@ -3396,12 +3615,10 @@
                 <w:rFonts w:eastAsia="Times New Roman"/>
                 <w:color w:val="1F2328"/>
               </w:rPr>
-              <w:t>Mariana Chavez Avila</w:t>
-            </w:r>
-          </w:p>
-        </w:tc>
-      </w:tr>
-      <w:tr>
+              <w:t>Quality Manager</w:t>
+            </w:r>
+          </w:p>
+        </w:tc>
         <w:tc>
           <w:tcPr>
             <w:tcW w:w="0" w:type="auto"/>
@@ -3416,15 +3633,76 @@
                 <w:color w:val="1F2328"/>
               </w:rPr>
             </w:pPr>
+            <w:proofErr w:type="spellStart"/>
             <w:r>
               <w:rPr>
                 <w:rFonts w:eastAsia="Times New Roman"/>
                 <w:color w:val="1F2328"/>
               </w:rPr>
-              <w:t>Software Engineer</w:t>
-            </w:r>
-          </w:p>
-        </w:tc>
+              <w:t>Thirthashri</w:t>
+            </w:r>
+            <w:proofErr w:type="spellEnd"/>
+            <w:r>
+              <w:rPr>
+                <w:rFonts w:eastAsia="Times New Roman"/>
+                <w:color w:val="1F2328"/>
+              </w:rPr>
+              <w:t xml:space="preserve"> Gowli Ganesh</w:t>
+            </w:r>
+          </w:p>
+        </w:tc>
+      </w:tr>
+      <w:tr>
+        <w:tc>
+          <w:tcPr>
+            <w:tcW w:w="0" w:type="auto"/>
+            <w:shd w:val="clear" w:color="auto" w:fill="F2F8FD"/>
+            <w:vAlign w:val="center"/>
+            <w:hideMark/>
+          </w:tcPr>
+          <w:p>
+            <w:pPr>
+              <w:spacing w:line="360" w:lineRule="auto"/>
+              <w:rPr>
+                <w:rFonts w:eastAsia="Times New Roman"/>
+                <w:color w:val="1F2328"/>
+              </w:rPr>
+            </w:pPr>
+            <w:r>
+              <w:rPr>
+                <w:rFonts w:eastAsia="Times New Roman"/>
+                <w:color w:val="1F2328"/>
+              </w:rPr>
+              <w:t>Safety Engineer</w:t>
+            </w:r>
+          </w:p>
+        </w:tc>
+        <w:tc>
+          <w:tcPr>
+            <w:tcW w:w="0" w:type="auto"/>
+            <w:shd w:val="clear" w:color="auto" w:fill="F2F8FD"/>
+            <w:vAlign w:val="center"/>
+            <w:hideMark/>
+          </w:tcPr>
+          <w:p>
+            <w:pPr>
+              <w:spacing w:line="360" w:lineRule="auto"/>
+              <w:rPr>
+                <w:rFonts w:eastAsia="Times New Roman"/>
+                <w:color w:val="1F2328"/>
+              </w:rPr>
+            </w:pPr>
+            <w:r>
+              <w:rPr>
+                <w:rFonts w:eastAsia="Times New Roman"/>
+                <w:color w:val="1F2328"/>
+              </w:rPr>
+              <w:t>Paresh Sanjiv Patil</w:t>
+            </w:r>
+          </w:p>
+        </w:tc>
+      </w:tr>
+      <w:tr>
         <w:tc>
           <w:tcPr>
             <w:tcW w:w="0" w:type="auto"/>
@@ -3444,28 +3722,10 @@
                 <w:rFonts w:eastAsia="Times New Roman"/>
                 <w:color w:val="1F2328"/>
               </w:rPr>
-              <w:t xml:space="preserve">Mrunal </w:t>
-            </w:r>
-            <w:proofErr w:type="spellStart"/>
-            <w:r>
-              <w:rPr>
-                <w:rFonts w:eastAsia="Times New Roman"/>
-                <w:color w:val="1F2328"/>
-              </w:rPr>
-              <w:t>Sahebrao</w:t>
-            </w:r>
-            <w:proofErr w:type="spellEnd"/>
-            <w:r>
-              <w:rPr>
-                <w:rFonts w:eastAsia="Times New Roman"/>
-                <w:color w:val="1F2328"/>
-              </w:rPr>
-              <w:t xml:space="preserve"> Ghotekar</w:t>
-            </w:r>
-          </w:p>
-        </w:tc>
-      </w:tr>
-      <w:tr>
+              <w:t>Safety Engineer</w:t>
+            </w:r>
+          </w:p>
+        </w:tc>
         <w:tc>
           <w:tcPr>
             <w:tcW w:w="0" w:type="auto"/>
@@ -3485,10 +3745,71 @@
                 <w:rFonts w:eastAsia="Times New Roman"/>
                 <w:color w:val="1F2328"/>
               </w:rPr>
-              <w:t>Quality Manager</w:t>
-            </w:r>
-          </w:p>
-        </w:tc>
+              <w:t xml:space="preserve">Atharva </w:t>
+            </w:r>
+            <w:proofErr w:type="spellStart"/>
+            <w:r>
+              <w:rPr>
+                <w:rFonts w:eastAsia="Times New Roman"/>
+                <w:color w:val="1F2328"/>
+              </w:rPr>
+              <w:t>Banarase</w:t>
+            </w:r>
+            <w:proofErr w:type="spellEnd"/>
+          </w:p>
+        </w:tc>
+      </w:tr>
+      <w:tr>
+        <w:tc>
+          <w:tcPr>
+            <w:tcW w:w="0" w:type="auto"/>
+            <w:shd w:val="clear" w:color="auto" w:fill="F2F8FD"/>
+            <w:vAlign w:val="center"/>
+            <w:hideMark/>
+          </w:tcPr>
+          <w:p>
+            <w:pPr>
+              <w:spacing w:line="360" w:lineRule="auto"/>
+              <w:rPr>
+                <w:rFonts w:eastAsia="Times New Roman"/>
+                <w:color w:val="1F2328"/>
+              </w:rPr>
+            </w:pPr>
+            <w:r>
+              <w:rPr>
+                <w:rFonts w:eastAsia="Times New Roman"/>
+                <w:color w:val="1F2328"/>
+              </w:rPr>
+              <w:t>Safety Analyst HARA</w:t>
+            </w:r>
+          </w:p>
+        </w:tc>
+        <w:tc>
+          <w:tcPr>
+            <w:tcW w:w="0" w:type="auto"/>
+            <w:shd w:val="clear" w:color="auto" w:fill="F2F8FD"/>
+            <w:vAlign w:val="center"/>
+            <w:hideMark/>
+          </w:tcPr>
+          <w:p>
+            <w:pPr>
+              <w:spacing w:line="360" w:lineRule="auto"/>
+              <w:rPr>
+                <w:rFonts w:eastAsia="Times New Roman"/>
+                <w:color w:val="1F2328"/>
+              </w:rPr>
+            </w:pPr>
+            <w:r>
+              <w:rPr>
+                <w:rFonts w:eastAsia="Times New Roman"/>
+                <w:color w:val="1F2328"/>
+              </w:rPr>
+              <w:t>Sara Nematollahi</w:t>
+            </w:r>
+          </w:p>
+        </w:tc>
+      </w:tr>
+      <w:tr>
         <w:tc>
           <w:tcPr>
             <w:tcW w:w="0" w:type="auto"/>
@@ -3503,26 +3824,15 @@
                 <w:color w:val="1F2328"/>
               </w:rPr>
             </w:pPr>
-            <w:proofErr w:type="spellStart"/>
             <w:r>
               <w:rPr>
                 <w:rFonts w:eastAsia="Times New Roman"/>
                 <w:color w:val="1F2328"/>
               </w:rPr>
-              <w:t>Thirthashri</w:t>
-            </w:r>
-            <w:proofErr w:type="spellEnd"/>
-            <w:r>
-              <w:rPr>
-                <w:rFonts w:eastAsia="Times New Roman"/>
-                <w:color w:val="1F2328"/>
-              </w:rPr>
-              <w:t xml:space="preserve"> Gowli Ganesh</w:t>
-            </w:r>
-          </w:p>
-        </w:tc>
-      </w:tr>
-      <w:tr>
+              <w:t>Safety Analyst HARA</w:t>
+            </w:r>
+          </w:p>
+        </w:tc>
         <w:tc>
           <w:tcPr>
             <w:tcW w:w="0" w:type="auto"/>
@@ -3537,15 +3847,110 @@
                 <w:color w:val="1F2328"/>
               </w:rPr>
             </w:pPr>
+            <w:proofErr w:type="spellStart"/>
             <w:r>
               <w:rPr>
                 <w:rFonts w:eastAsia="Times New Roman"/>
                 <w:color w:val="1F2328"/>
               </w:rPr>
-              <w:t>Safety Engineer</w:t>
-            </w:r>
-          </w:p>
-        </w:tc>
+              <w:t>Sathyashree</w:t>
+            </w:r>
+            <w:proofErr w:type="spellEnd"/>
+            <w:r>
+              <w:rPr>
+                <w:rFonts w:eastAsia="Times New Roman"/>
+                <w:color w:val="1F2328"/>
+              </w:rPr>
+              <w:t xml:space="preserve"> </w:t>
+            </w:r>
+            <w:proofErr w:type="spellStart"/>
+            <w:r>
+              <w:rPr>
+                <w:rFonts w:eastAsia="Times New Roman"/>
+                <w:color w:val="1F2328"/>
+              </w:rPr>
+              <w:t>Vignasante</w:t>
+            </w:r>
+            <w:proofErr w:type="spellEnd"/>
+            <w:r>
+              <w:rPr>
+                <w:rFonts w:eastAsia="Times New Roman"/>
+                <w:color w:val="1F2328"/>
+              </w:rPr>
+              <w:t xml:space="preserve"> </w:t>
+            </w:r>
+            <w:proofErr w:type="spellStart"/>
+            <w:r>
+              <w:rPr>
+                <w:rFonts w:eastAsia="Times New Roman"/>
+                <w:color w:val="1F2328"/>
+              </w:rPr>
+              <w:t>Ramegowda</w:t>
+            </w:r>
+            <w:proofErr w:type="spellEnd"/>
+          </w:p>
+        </w:tc>
+      </w:tr>
+      <w:tr>
+        <w:tc>
+          <w:tcPr>
+            <w:tcW w:w="0" w:type="auto"/>
+            <w:shd w:val="clear" w:color="auto" w:fill="F2F8FD"/>
+            <w:vAlign w:val="center"/>
+            <w:hideMark/>
+          </w:tcPr>
+          <w:p>
+            <w:pPr>
+              <w:spacing w:line="360" w:lineRule="auto"/>
+              <w:rPr>
+                <w:rFonts w:eastAsia="Times New Roman"/>
+                <w:color w:val="1F2328"/>
+              </w:rPr>
+            </w:pPr>
+            <w:r>
+              <w:rPr>
+                <w:rFonts w:eastAsia="Times New Roman"/>
+                <w:color w:val="1F2328"/>
+              </w:rPr>
+              <w:t>System Engineer</w:t>
+            </w:r>
+          </w:p>
+        </w:tc>
+        <w:tc>
+          <w:tcPr>
+            <w:tcW w:w="0" w:type="auto"/>
+            <w:shd w:val="clear" w:color="auto" w:fill="F2F8FD"/>
+            <w:vAlign w:val="center"/>
+            <w:hideMark/>
+          </w:tcPr>
+          <w:p>
+            <w:pPr>
+              <w:spacing w:line="360" w:lineRule="auto"/>
+              <w:rPr>
+                <w:rFonts w:eastAsia="Times New Roman"/>
+                <w:color w:val="1F2328"/>
+              </w:rPr>
+            </w:pPr>
+            <w:r>
+              <w:rPr>
+                <w:rFonts w:eastAsia="Times New Roman"/>
+                <w:color w:val="1F2328"/>
+              </w:rPr>
+              <w:t xml:space="preserve">Atharva Prasad </w:t>
+            </w:r>
+            <w:proofErr w:type="spellStart"/>
+            <w:r>
+              <w:rPr>
+                <w:rFonts w:eastAsia="Times New Roman"/>
+                <w:color w:val="1F2328"/>
+              </w:rPr>
+              <w:t>Avsare</w:t>
+            </w:r>
+            <w:proofErr w:type="spellEnd"/>
+          </w:p>
+        </w:tc>
+      </w:tr>
+      <w:tr>
         <w:tc>
           <w:tcPr>
             <w:tcW w:w="0" w:type="auto"/>
@@ -3565,12 +3970,10 @@
                 <w:rFonts w:eastAsia="Times New Roman"/>
                 <w:color w:val="1F2328"/>
               </w:rPr>
-              <w:t>Paresh Sanjiv Patil</w:t>
-            </w:r>
-          </w:p>
-        </w:tc>
-      </w:tr>
-      <w:tr>
+              <w:t>System Architect</w:t>
+            </w:r>
+          </w:p>
+        </w:tc>
         <w:tc>
           <w:tcPr>
             <w:tcW w:w="0" w:type="auto"/>
@@ -3590,13 +3993,16 @@
                 <w:rFonts w:eastAsia="Times New Roman"/>
                 <w:color w:val="1F2328"/>
               </w:rPr>
-              <w:t>Safety Engineer</w:t>
-            </w:r>
-          </w:p>
-        </w:tc>
+              <w:t>Om Naik</w:t>
+            </w:r>
+          </w:p>
+        </w:tc>
+      </w:tr>
+      <w:tr>
         <w:tc>
           <w:tcPr>
             <w:tcW w:w="0" w:type="auto"/>
+            <w:shd w:val="clear" w:color="auto" w:fill="F2F8FD"/>
             <w:vAlign w:val="center"/>
             <w:hideMark/>
           </w:tcPr>
@@ -3613,282 +4019,14 @@
                 <w:rFonts w:eastAsia="Times New Roman"/>
                 <w:color w:val="1F2328"/>
               </w:rPr>
-              <w:t xml:space="preserve">Atharva </w:t>
-            </w:r>
-            <w:proofErr w:type="spellStart"/>
-            <w:r>
-              <w:rPr>
-                <w:rFonts w:eastAsia="Times New Roman"/>
-                <w:color w:val="1F2328"/>
-              </w:rPr>
-              <w:t>Banarase</w:t>
-            </w:r>
-            <w:proofErr w:type="spellEnd"/>
-          </w:p>
-        </w:tc>
-      </w:tr>
-      <w:tr>
+              <w:t>Testing Engineer V and V</w:t>
+            </w:r>
+          </w:p>
+        </w:tc>
         <w:tc>
           <w:tcPr>
             <w:tcW w:w="0" w:type="auto"/>
-            <w:vAlign w:val="center"/>
-            <w:hideMark/>
-          </w:tcPr>
-          <w:p>
-            <w:pPr>
-              <w:spacing w:line="360" w:lineRule="auto"/>
-              <w:rPr>
-                <w:rFonts w:eastAsia="Times New Roman"/>
-                <w:color w:val="1F2328"/>
-              </w:rPr>
-            </w:pPr>
-            <w:r>
-              <w:rPr>
-                <w:rFonts w:eastAsia="Times New Roman"/>
-                <w:color w:val="1F2328"/>
-              </w:rPr>
-              <w:t>Safety Analyst HARA</w:t>
-            </w:r>
-          </w:p>
-        </w:tc>
-        <w:tc>
-          <w:tcPr>
-            <w:tcW w:w="0" w:type="auto"/>
-            <w:vAlign w:val="center"/>
-            <w:hideMark/>
-          </w:tcPr>
-          <w:p>
-            <w:pPr>
-              <w:spacing w:line="360" w:lineRule="auto"/>
-              <w:rPr>
-                <w:rFonts w:eastAsia="Times New Roman"/>
-                <w:color w:val="1F2328"/>
-              </w:rPr>
-            </w:pPr>
-            <w:r>
-              <w:rPr>
-                <w:rFonts w:eastAsia="Times New Roman"/>
-                <w:color w:val="1F2328"/>
-              </w:rPr>
-              <w:t>Sara Nematollahi</w:t>
-            </w:r>
-          </w:p>
-        </w:tc>
-      </w:tr>
-      <w:tr>
-        <w:tc>
-          <w:tcPr>
-            <w:tcW w:w="0" w:type="auto"/>
-            <w:vAlign w:val="center"/>
-            <w:hideMark/>
-          </w:tcPr>
-          <w:p>
-            <w:pPr>
-              <w:spacing w:line="360" w:lineRule="auto"/>
-              <w:rPr>
-                <w:rFonts w:eastAsia="Times New Roman"/>
-                <w:color w:val="1F2328"/>
-              </w:rPr>
-            </w:pPr>
-            <w:r>
-              <w:rPr>
-                <w:rFonts w:eastAsia="Times New Roman"/>
-                <w:color w:val="1F2328"/>
-              </w:rPr>
-              <w:t>Safety Analyst HARA</w:t>
-            </w:r>
-          </w:p>
-        </w:tc>
-        <w:tc>
-          <w:tcPr>
-            <w:tcW w:w="0" w:type="auto"/>
-            <w:vAlign w:val="center"/>
-            <w:hideMark/>
-          </w:tcPr>
-          <w:p>
-            <w:pPr>
-              <w:spacing w:line="360" w:lineRule="auto"/>
-              <w:rPr>
-                <w:rFonts w:eastAsia="Times New Roman"/>
-                <w:color w:val="1F2328"/>
-              </w:rPr>
-            </w:pPr>
-            <w:proofErr w:type="spellStart"/>
-            <w:r>
-              <w:rPr>
-                <w:rFonts w:eastAsia="Times New Roman"/>
-                <w:color w:val="1F2328"/>
-              </w:rPr>
-              <w:t>Sathyashree</w:t>
-            </w:r>
-            <w:proofErr w:type="spellEnd"/>
-            <w:r>
-              <w:rPr>
-                <w:rFonts w:eastAsia="Times New Roman"/>
-                <w:color w:val="1F2328"/>
-              </w:rPr>
-              <w:t xml:space="preserve"> </w:t>
-            </w:r>
-            <w:proofErr w:type="spellStart"/>
-            <w:r>
-              <w:rPr>
-                <w:rFonts w:eastAsia="Times New Roman"/>
-                <w:color w:val="1F2328"/>
-              </w:rPr>
-              <w:t>Vignasante</w:t>
-            </w:r>
-            <w:proofErr w:type="spellEnd"/>
-            <w:r>
-              <w:rPr>
-                <w:rFonts w:eastAsia="Times New Roman"/>
-                <w:color w:val="1F2328"/>
-              </w:rPr>
-              <w:t xml:space="preserve"> </w:t>
-            </w:r>
-            <w:proofErr w:type="spellStart"/>
-            <w:r>
-              <w:rPr>
-                <w:rFonts w:eastAsia="Times New Roman"/>
-                <w:color w:val="1F2328"/>
-              </w:rPr>
-              <w:t>Ramegowda</w:t>
-            </w:r>
-            <w:proofErr w:type="spellEnd"/>
-          </w:p>
-        </w:tc>
-      </w:tr>
-      <w:tr>
-        <w:tc>
-          <w:tcPr>
-            <w:tcW w:w="0" w:type="auto"/>
-            <w:vAlign w:val="center"/>
-            <w:hideMark/>
-          </w:tcPr>
-          <w:p>
-            <w:pPr>
-              <w:spacing w:line="360" w:lineRule="auto"/>
-              <w:rPr>
-                <w:rFonts w:eastAsia="Times New Roman"/>
-                <w:color w:val="1F2328"/>
-              </w:rPr>
-            </w:pPr>
-            <w:r>
-              <w:rPr>
-                <w:rFonts w:eastAsia="Times New Roman"/>
-                <w:color w:val="1F2328"/>
-              </w:rPr>
-              <w:t>System Engineer</w:t>
-            </w:r>
-          </w:p>
-        </w:tc>
-        <w:tc>
-          <w:tcPr>
-            <w:tcW w:w="0" w:type="auto"/>
-            <w:vAlign w:val="center"/>
-            <w:hideMark/>
-          </w:tcPr>
-          <w:p>
-            <w:pPr>
-              <w:spacing w:line="360" w:lineRule="auto"/>
-              <w:rPr>
-                <w:rFonts w:eastAsia="Times New Roman"/>
-                <w:color w:val="1F2328"/>
-              </w:rPr>
-            </w:pPr>
-            <w:r>
-              <w:rPr>
-                <w:rFonts w:eastAsia="Times New Roman"/>
-                <w:color w:val="1F2328"/>
-              </w:rPr>
-              <w:t xml:space="preserve">Atharva Prasad </w:t>
-            </w:r>
-            <w:proofErr w:type="spellStart"/>
-            <w:r>
-              <w:rPr>
-                <w:rFonts w:eastAsia="Times New Roman"/>
-                <w:color w:val="1F2328"/>
-              </w:rPr>
-              <w:t>Avsare</w:t>
-            </w:r>
-            <w:proofErr w:type="spellEnd"/>
-          </w:p>
-        </w:tc>
-      </w:tr>
-      <w:tr>
-        <w:tc>
-          <w:tcPr>
-            <w:tcW w:w="0" w:type="auto"/>
-            <w:vAlign w:val="center"/>
-            <w:hideMark/>
-          </w:tcPr>
-          <w:p>
-            <w:pPr>
-              <w:spacing w:line="360" w:lineRule="auto"/>
-              <w:rPr>
-                <w:rFonts w:eastAsia="Times New Roman"/>
-                <w:color w:val="1F2328"/>
-              </w:rPr>
-            </w:pPr>
-            <w:r>
-              <w:rPr>
-                <w:rFonts w:eastAsia="Times New Roman"/>
-                <w:color w:val="1F2328"/>
-              </w:rPr>
-              <w:t>System Architect</w:t>
-            </w:r>
-          </w:p>
-        </w:tc>
-        <w:tc>
-          <w:tcPr>
-            <w:tcW w:w="0" w:type="auto"/>
-            <w:vAlign w:val="center"/>
-            <w:hideMark/>
-          </w:tcPr>
-          <w:p>
-            <w:pPr>
-              <w:spacing w:line="360" w:lineRule="auto"/>
-              <w:rPr>
-                <w:rFonts w:eastAsia="Times New Roman"/>
-                <w:color w:val="1F2328"/>
-              </w:rPr>
-            </w:pPr>
-            <w:r>
-              <w:rPr>
-                <w:rFonts w:eastAsia="Times New Roman"/>
-                <w:color w:val="1F2328"/>
-              </w:rPr>
-              <w:t>Om Naik</w:t>
-            </w:r>
-          </w:p>
-        </w:tc>
-      </w:tr>
-      <w:tr>
-        <w:tc>
-          <w:tcPr>
-            <w:tcW w:w="0" w:type="auto"/>
-            <w:vAlign w:val="center"/>
-            <w:hideMark/>
-          </w:tcPr>
-          <w:p>
-            <w:pPr>
-              <w:spacing w:line="360" w:lineRule="auto"/>
-              <w:rPr>
-                <w:rFonts w:eastAsia="Times New Roman"/>
-                <w:color w:val="1F2328"/>
-              </w:rPr>
-            </w:pPr>
-            <w:r>
-              <w:rPr>
-                <w:rFonts w:eastAsia="Times New Roman"/>
-                <w:color w:val="1F2328"/>
-              </w:rPr>
-              <w:t>Testing Engineer V and V</w:t>
-            </w:r>
-          </w:p>
-        </w:tc>
-        <w:tc>
-          <w:tcPr>
-            <w:tcW w:w="0" w:type="auto"/>
+            <w:shd w:val="clear" w:color="auto" w:fill="F2F8FD"/>
             <w:vAlign w:val="center"/>
             <w:hideMark/>
           </w:tcPr>
@@ -3936,15 +4074,21 @@
     <w:p>
       <w:pPr>
         <w:spacing w:after="120"/>
+        <w:jc w:val="both"/>
       </w:pPr>
       <w:r>
         <w:t>The Airbag Electronic Control Unit (ACU) is a safety-critical automotive component responsible for real-time detection of crash events and controlled deployment of occupant restraint systems (frontal, side, and curtain airbags together with seatbelt pretensioners).</w:t>
       </w:r>
     </w:p>
-    <w:p/>
+    <w:p>
+      <w:pPr>
+        <w:jc w:val="both"/>
+      </w:pPr>
+    </w:p>
     <w:p>
       <w:pPr>
         <w:spacing w:after="120"/>
+        <w:jc w:val="both"/>
       </w:pPr>
       <w:r>
         <w:t xml:space="preserve">In the laboratory implementation, the system is realized on two Arduino Due microcontroller boards operating in a dual-channel (2oo2) redundant architecture. Three potentiometers on a breadboard simulate the </w:t>
@@ -4063,52 +4207,16 @@
     <w:p>
       <w:pPr>
         <w:spacing w:after="120"/>
+        <w:jc w:val="both"/>
       </w:pPr>
       <w:r>
         <w:t>The following functions performed by the Airbag ECU are identified as safety-relevant and form the basis for hazard analysis:</w:t>
       </w:r>
     </w:p>
-    <w:p/>
     <w:p>
       <w:pPr>
-        <w:pStyle w:val="ListParagraph"/>
-        <w:numPr>
-          <w:ilvl w:val="0"/>
-          <w:numId w:val="2"/>
-        </w:numPr>
+        <w:jc w:val="both"/>
       </w:pPr>
-      <w:r>
-        <w:rPr>
-          <w:b/>
-          <w:bCs/>
-        </w:rPr>
-        <w:t xml:space="preserve">F1 </w:t>
-      </w:r>
-      <w:r>
-        <w:rPr>
-          <w:b/>
-          <w:bCs/>
-        </w:rPr>
-        <w:t xml:space="preserve">- </w:t>
-      </w:r>
-      <w:r>
-        <w:rPr>
-          <w:b/>
-          <w:bCs/>
-        </w:rPr>
-        <w:t>Crash Detection:</w:t>
-      </w:r>
-      <w:r>
-        <w:t xml:space="preserve"> continuous monitoring and fusion of accelerometer, gyroscope, and pressure sensor signals; detection of crash events above deployment threshold within ≤ 15 </w:t>
-      </w:r>
-      <w:proofErr w:type="spellStart"/>
-      <w:r>
-        <w:t>ms</w:t>
-      </w:r>
-      <w:proofErr w:type="spellEnd"/>
-      <w:r>
-        <w:t>.</w:t>
-      </w:r>
     </w:p>
     <w:p>
       <w:pPr>
@@ -4117,13 +4225,14 @@
           <w:ilvl w:val="0"/>
           <w:numId w:val="2"/>
         </w:numPr>
+        <w:jc w:val="both"/>
       </w:pPr>
       <w:r>
         <w:rPr>
           <w:b/>
           <w:bCs/>
         </w:rPr>
-        <w:t xml:space="preserve">F2 </w:t>
+        <w:t xml:space="preserve">F1 </w:t>
       </w:r>
       <w:r>
         <w:rPr>
@@ -4137,10 +4246,18 @@
           <w:b/>
           <w:bCs/>
         </w:rPr>
-        <w:t>Airbag Deployment</w:t>
-      </w:r>
-      <w:r>
-        <w:t>: controlled actuation of driver and passenger frontal airbag squib channels upon valid deployment decision; suppression of passenger channel when OCS / baby-seat input is active.</w:t>
+        <w:t>Crash Detection:</w:t>
+      </w:r>
+      <w:r>
+        <w:t xml:space="preserve"> continuous monitoring and fusion of accelerometer, gyroscope, and pressure sensor signals; detection of crash events above deployment threshold within ≤ 15 </w:t>
+      </w:r>
+      <w:proofErr w:type="spellStart"/>
+      <w:r>
+        <w:t>ms</w:t>
+      </w:r>
+      <w:proofErr w:type="spellEnd"/>
+      <w:r>
+        <w:t>.</w:t>
       </w:r>
     </w:p>
     <w:p>
@@ -4150,38 +4267,31 @@
           <w:ilvl w:val="0"/>
           <w:numId w:val="2"/>
         </w:numPr>
+        <w:jc w:val="both"/>
       </w:pPr>
       <w:r>
         <w:rPr>
           <w:b/>
           <w:bCs/>
         </w:rPr>
-        <w:t xml:space="preserve">F3 </w:t>
+        <w:t xml:space="preserve">F2 </w:t>
       </w:r>
       <w:r>
         <w:rPr>
           <w:b/>
           <w:bCs/>
         </w:rPr>
-        <w:t>-</w:t>
+        <w:t xml:space="preserve">- </w:t>
       </w:r>
       <w:r>
         <w:rPr>
           <w:b/>
           <w:bCs/>
         </w:rPr>
-        <w:t xml:space="preserve"> Sensor Monitoring and Plausibility Check</w:t>
-      </w:r>
-      <w:r>
-        <w:t xml:space="preserve">: continuous range checking of all </w:t>
-      </w:r>
-      <w:proofErr w:type="spellStart"/>
-      <w:r>
-        <w:t>analog</w:t>
-      </w:r>
-      <w:proofErr w:type="spellEnd"/>
-      <w:r>
-        <w:t xml:space="preserve"> inputs (POTI-1, POTI-2, POTI-3) and digital input (baby-seat switch); out-of-range or stuck faults trigger DTC and DWI activation.</w:t>
+        <w:t>Airbag Deployment</w:t>
+      </w:r>
+      <w:r>
+        <w:t>: controlled actuation of driver and passenger frontal airbag squib channels upon valid deployment decision; suppression of passenger channel when OCS / baby-seat input is active.</w:t>
       </w:r>
     </w:p>
     <w:p>
@@ -4191,13 +4301,14 @@
           <w:ilvl w:val="0"/>
           <w:numId w:val="2"/>
         </w:numPr>
+        <w:jc w:val="both"/>
       </w:pPr>
       <w:r>
         <w:rPr>
           <w:b/>
           <w:bCs/>
         </w:rPr>
-        <w:t xml:space="preserve">F4 </w:t>
+        <w:t xml:space="preserve">F3 </w:t>
       </w:r>
       <w:r>
         <w:rPr>
@@ -4211,26 +4322,18 @@
           <w:b/>
           <w:bCs/>
         </w:rPr>
-        <w:t xml:space="preserve"> System Self-Test and Diagnosis:</w:t>
-      </w:r>
-      <w:r>
-        <w:t xml:space="preserve"> Power-On Self-Test (POST) within 800 </w:t>
+        <w:t xml:space="preserve"> Sensor Monitoring and Plausibility Check</w:t>
+      </w:r>
+      <w:r>
+        <w:t xml:space="preserve">: continuous range checking of all </w:t>
       </w:r>
       <w:proofErr w:type="spellStart"/>
       <w:r>
-        <w:t>ms</w:t>
+        <w:t>analog</w:t>
       </w:r>
       <w:proofErr w:type="spellEnd"/>
       <w:r>
-        <w:t xml:space="preserve">; background monitoring at ≤ 100 </w:t>
-      </w:r>
-      <w:proofErr w:type="spellStart"/>
-      <w:r>
-        <w:t>ms</w:t>
-      </w:r>
-      <w:proofErr w:type="spellEnd"/>
-      <w:r>
-        <w:t xml:space="preserve"> intervals; squib loop resistance monitoring; Flash CRC check; watchdog supervision.</w:t>
+        <w:t xml:space="preserve"> inputs (POTI-1, POTI-2, POTI-3) and digital input (baby-seat switch); out-of-range or stuck faults trigger DTC and DWI activation.</w:t>
       </w:r>
     </w:p>
     <w:p>
@@ -4240,13 +4343,14 @@
           <w:ilvl w:val="0"/>
           <w:numId w:val="2"/>
         </w:numPr>
+        <w:jc w:val="both"/>
       </w:pPr>
       <w:r>
         <w:rPr>
           <w:b/>
           <w:bCs/>
         </w:rPr>
-        <w:t xml:space="preserve">F5 </w:t>
+        <w:t xml:space="preserve">F4 </w:t>
       </w:r>
       <w:r>
         <w:rPr>
@@ -4260,10 +4364,26 @@
           <w:b/>
           <w:bCs/>
         </w:rPr>
-        <w:t xml:space="preserve"> Fail-Safe / Fallback at Failure States</w:t>
-      </w:r>
-      <w:r>
-        <w:t>: safe-state management including deployment inhibit (SS-01), partial-channel isolation (SS-04), and passenger airbag suppression on OCS fault (SS-03).</w:t>
+        <w:t xml:space="preserve"> System Self-Test and Diagnosis:</w:t>
+      </w:r>
+      <w:r>
+        <w:t xml:space="preserve"> Power-On Self-Test (POST) within 800 </w:t>
+      </w:r>
+      <w:proofErr w:type="spellStart"/>
+      <w:r>
+        <w:t>ms</w:t>
+      </w:r>
+      <w:proofErr w:type="spellEnd"/>
+      <w:r>
+        <w:t xml:space="preserve">; background monitoring at ≤ 100 </w:t>
+      </w:r>
+      <w:proofErr w:type="spellStart"/>
+      <w:r>
+        <w:t>ms</w:t>
+      </w:r>
+      <w:proofErr w:type="spellEnd"/>
+      <w:r>
+        <w:t xml:space="preserve"> intervals; squib loop resistance monitoring; Flash CRC check; watchdog supervision.</w:t>
       </w:r>
     </w:p>
     <w:p>
@@ -4273,6 +4393,41 @@
           <w:ilvl w:val="0"/>
           <w:numId w:val="2"/>
         </w:numPr>
+        <w:jc w:val="both"/>
+      </w:pPr>
+      <w:r>
+        <w:rPr>
+          <w:b/>
+          <w:bCs/>
+        </w:rPr>
+        <w:t xml:space="preserve">F5 </w:t>
+      </w:r>
+      <w:r>
+        <w:rPr>
+          <w:b/>
+          <w:bCs/>
+        </w:rPr>
+        <w:t>-</w:t>
+      </w:r>
+      <w:r>
+        <w:rPr>
+          <w:b/>
+          <w:bCs/>
+        </w:rPr>
+        <w:t xml:space="preserve"> Fail-Safe / Fallback at Failure States</w:t>
+      </w:r>
+      <w:r>
+        <w:t>: safe-state management including deployment inhibit (SS-01), partial-channel isolation (SS-04), and passenger airbag suppression on OCS fault (SS-03).</w:t>
+      </w:r>
+    </w:p>
+    <w:p>
+      <w:pPr>
+        <w:pStyle w:val="ListParagraph"/>
+        <w:numPr>
+          <w:ilvl w:val="0"/>
+          <w:numId w:val="2"/>
+        </w:numPr>
+        <w:jc w:val="both"/>
       </w:pPr>
       <w:r>
         <w:rPr>
@@ -4315,8 +4470,16 @@
         <w:t xml:space="preserve"> of any detected fault.</w:t>
       </w:r>
     </w:p>
-    <w:p/>
-    <w:p/>
+    <w:p>
+      <w:pPr>
+        <w:jc w:val="both"/>
+      </w:pPr>
+    </w:p>
+    <w:p>
+      <w:pPr>
+        <w:jc w:val="both"/>
+      </w:pPr>
+    </w:p>
     <w:p>
       <w:pPr>
         <w:pStyle w:val="Heading1"/>
@@ -4343,15 +4506,13 @@
           <w:smallCaps w:val="0"/>
           <w:noProof/>
           <w:kern w:val="2"/>
-          <w:sz w:val="28"/>
-          <w:szCs w:val="28"/>
+          <w:sz w:val="24"/>
+          <w:lang w:val="de-DE" w:eastAsia="de-DE"/>
           <w14:ligatures w14:val="standardContextual"/>
         </w:rPr>
       </w:pPr>
       <w:r>
         <w:rPr>
-          <w:rFonts w:ascii="Arial" w:hAnsi="Arial"/>
-          <w:smallCaps w:val="0"/>
           <w:sz w:val="21"/>
           <w:szCs w:val="21"/>
         </w:rPr>
@@ -4359,8 +4520,6 @@
       </w:r>
       <w:r>
         <w:rPr>
-          <w:rFonts w:ascii="Arial" w:hAnsi="Arial"/>
-          <w:smallCaps w:val="0"/>
           <w:sz w:val="21"/>
           <w:szCs w:val="21"/>
         </w:rPr>
@@ -4368,20 +4527,16 @@
       </w:r>
       <w:r>
         <w:rPr>
-          <w:rFonts w:ascii="Arial" w:hAnsi="Arial"/>
-          <w:smallCaps w:val="0"/>
           <w:sz w:val="21"/>
           <w:szCs w:val="21"/>
         </w:rPr>
         <w:fldChar w:fldCharType="separate"/>
       </w:r>
-      <w:hyperlink w:anchor="_Toc231936653" w:history="1">
+      <w:hyperlink w:anchor="_Toc232167492" w:history="1">
         <w:r>
           <w:rPr>
             <w:rStyle w:val="Hyperlink"/>
             <w:noProof/>
-            <w:sz w:val="21"/>
-            <w:szCs w:val="21"/>
           </w:rPr>
           <w:t>Table 1: Meetings</w:t>
         </w:r>
@@ -4389,8 +4544,6 @@
           <w:rPr>
             <w:noProof/>
             <w:webHidden/>
-            <w:sz w:val="21"/>
-            <w:szCs w:val="21"/>
           </w:rPr>
           <w:tab/>
         </w:r>
@@ -4398,8 +4551,6 @@
           <w:rPr>
             <w:noProof/>
             <w:webHidden/>
-            <w:sz w:val="21"/>
-            <w:szCs w:val="21"/>
           </w:rPr>
           <w:fldChar w:fldCharType="begin"/>
         </w:r>
@@ -4407,25 +4558,19 @@
           <w:rPr>
             <w:noProof/>
             <w:webHidden/>
-            <w:sz w:val="21"/>
-            <w:szCs w:val="21"/>
           </w:rPr>
-          <w:instrText xml:space="preserve"> PAGEREF _Toc231936653 \h </w:instrText>
+          <w:instrText xml:space="preserve"> PAGEREF _Toc232167492 \h </w:instrText>
         </w:r>
         <w:r>
           <w:rPr>
             <w:noProof/>
             <w:webHidden/>
-            <w:sz w:val="21"/>
-            <w:szCs w:val="21"/>
           </w:rPr>
         </w:r>
         <w:r>
           <w:rPr>
             <w:noProof/>
             <w:webHidden/>
-            <w:sz w:val="21"/>
-            <w:szCs w:val="21"/>
           </w:rPr>
           <w:fldChar w:fldCharType="separate"/>
         </w:r>
@@ -4433,8 +4578,6 @@
           <w:rPr>
             <w:noProof/>
             <w:webHidden/>
-            <w:sz w:val="21"/>
-            <w:szCs w:val="21"/>
           </w:rPr>
           <w:t>3</w:t>
         </w:r>
@@ -4442,8 +4585,6 @@
           <w:rPr>
             <w:noProof/>
             <w:webHidden/>
-            <w:sz w:val="21"/>
-            <w:szCs w:val="21"/>
           </w:rPr>
           <w:fldChar w:fldCharType="end"/>
         </w:r>
@@ -4460,18 +4601,16 @@
           <w:smallCaps w:val="0"/>
           <w:noProof/>
           <w:kern w:val="2"/>
-          <w:sz w:val="28"/>
-          <w:szCs w:val="28"/>
+          <w:sz w:val="24"/>
+          <w:lang w:val="de-DE" w:eastAsia="de-DE"/>
           <w14:ligatures w14:val="standardContextual"/>
         </w:rPr>
       </w:pPr>
-      <w:hyperlink w:anchor="_Toc231936654" w:history="1">
+      <w:hyperlink w:anchor="_Toc232167493" w:history="1">
         <w:r>
           <w:rPr>
             <w:rStyle w:val="Hyperlink"/>
             <w:noProof/>
-            <w:sz w:val="21"/>
-            <w:szCs w:val="21"/>
           </w:rPr>
           <w:t>Table 2 : Glossary</w:t>
         </w:r>
@@ -4479,8 +4618,6 @@
           <w:rPr>
             <w:noProof/>
             <w:webHidden/>
-            <w:sz w:val="21"/>
-            <w:szCs w:val="21"/>
           </w:rPr>
           <w:tab/>
         </w:r>
@@ -4488,8 +4625,6 @@
           <w:rPr>
             <w:noProof/>
             <w:webHidden/>
-            <w:sz w:val="21"/>
-            <w:szCs w:val="21"/>
           </w:rPr>
           <w:fldChar w:fldCharType="begin"/>
         </w:r>
@@ -4497,25 +4632,19 @@
           <w:rPr>
             <w:noProof/>
             <w:webHidden/>
-            <w:sz w:val="21"/>
-            <w:szCs w:val="21"/>
           </w:rPr>
-          <w:instrText xml:space="preserve"> PAGEREF _Toc231936654 \h </w:instrText>
+          <w:instrText xml:space="preserve"> PAGEREF _Toc232167493 \h </w:instrText>
         </w:r>
         <w:r>
           <w:rPr>
             <w:noProof/>
             <w:webHidden/>
-            <w:sz w:val="21"/>
-            <w:szCs w:val="21"/>
           </w:rPr>
         </w:r>
         <w:r>
           <w:rPr>
             <w:noProof/>
             <w:webHidden/>
-            <w:sz w:val="21"/>
-            <w:szCs w:val="21"/>
           </w:rPr>
           <w:fldChar w:fldCharType="separate"/>
         </w:r>
@@ -4523,8 +4652,6 @@
           <w:rPr>
             <w:noProof/>
             <w:webHidden/>
-            <w:sz w:val="21"/>
-            <w:szCs w:val="21"/>
           </w:rPr>
           <w:t>5</w:t>
         </w:r>
@@ -4532,8 +4659,6 @@
           <w:rPr>
             <w:noProof/>
             <w:webHidden/>
-            <w:sz w:val="21"/>
-            <w:szCs w:val="21"/>
           </w:rPr>
           <w:fldChar w:fldCharType="end"/>
         </w:r>
@@ -4550,18 +4675,16 @@
           <w:smallCaps w:val="0"/>
           <w:noProof/>
           <w:kern w:val="2"/>
-          <w:sz w:val="28"/>
-          <w:szCs w:val="28"/>
+          <w:sz w:val="24"/>
+          <w:lang w:val="de-DE" w:eastAsia="de-DE"/>
           <w14:ligatures w14:val="standardContextual"/>
         </w:rPr>
       </w:pPr>
-      <w:hyperlink w:anchor="_Toc231936655" w:history="1">
+      <w:hyperlink w:anchor="_Toc232167494" w:history="1">
         <w:r>
           <w:rPr>
             <w:rStyle w:val="Hyperlink"/>
             <w:noProof/>
-            <w:sz w:val="21"/>
-            <w:szCs w:val="21"/>
           </w:rPr>
           <w:t>Table 3: Team and Responsibilities</w:t>
         </w:r>
@@ -4569,8 +4692,6 @@
           <w:rPr>
             <w:noProof/>
             <w:webHidden/>
-            <w:sz w:val="21"/>
-            <w:szCs w:val="21"/>
           </w:rPr>
           <w:tab/>
         </w:r>
@@ -4578,8 +4699,6 @@
           <w:rPr>
             <w:noProof/>
             <w:webHidden/>
-            <w:sz w:val="21"/>
-            <w:szCs w:val="21"/>
           </w:rPr>
           <w:fldChar w:fldCharType="begin"/>
         </w:r>
@@ -4587,25 +4706,19 @@
           <w:rPr>
             <w:noProof/>
             <w:webHidden/>
-            <w:sz w:val="21"/>
-            <w:szCs w:val="21"/>
           </w:rPr>
-          <w:instrText xml:space="preserve"> PAGEREF _Toc231936655 \h </w:instrText>
+          <w:instrText xml:space="preserve"> PAGEREF _Toc232167494 \h </w:instrText>
         </w:r>
         <w:r>
           <w:rPr>
             <w:noProof/>
             <w:webHidden/>
-            <w:sz w:val="21"/>
-            <w:szCs w:val="21"/>
           </w:rPr>
         </w:r>
         <w:r>
           <w:rPr>
             <w:noProof/>
             <w:webHidden/>
-            <w:sz w:val="21"/>
-            <w:szCs w:val="21"/>
           </w:rPr>
           <w:fldChar w:fldCharType="separate"/>
         </w:r>
@@ -4613,8 +4726,6 @@
           <w:rPr>
             <w:noProof/>
             <w:webHidden/>
-            <w:sz w:val="21"/>
-            <w:szCs w:val="21"/>
           </w:rPr>
           <w:t>6</w:t>
         </w:r>
@@ -4622,8 +4733,6 @@
           <w:rPr>
             <w:noProof/>
             <w:webHidden/>
-            <w:sz w:val="21"/>
-            <w:szCs w:val="21"/>
           </w:rPr>
           <w:fldChar w:fldCharType="end"/>
         </w:r>
@@ -4640,18 +4749,16 @@
           <w:smallCaps w:val="0"/>
           <w:noProof/>
           <w:kern w:val="2"/>
-          <w:sz w:val="28"/>
-          <w:szCs w:val="28"/>
+          <w:sz w:val="24"/>
+          <w:lang w:val="de-DE" w:eastAsia="de-DE"/>
           <w14:ligatures w14:val="standardContextual"/>
         </w:rPr>
       </w:pPr>
-      <w:hyperlink w:anchor="_Toc231936656" w:history="1">
+      <w:hyperlink w:anchor="_Toc232167495" w:history="1">
         <w:r>
           <w:rPr>
             <w:rStyle w:val="Hyperlink"/>
             <w:noProof/>
-            <w:sz w:val="21"/>
-            <w:szCs w:val="21"/>
           </w:rPr>
           <w:t>Table 4: Dependent Documents</w:t>
         </w:r>
@@ -4659,8 +4766,6 @@
           <w:rPr>
             <w:noProof/>
             <w:webHidden/>
-            <w:sz w:val="21"/>
-            <w:szCs w:val="21"/>
           </w:rPr>
           <w:tab/>
         </w:r>
@@ -4668,8 +4773,6 @@
           <w:rPr>
             <w:noProof/>
             <w:webHidden/>
-            <w:sz w:val="21"/>
-            <w:szCs w:val="21"/>
           </w:rPr>
           <w:fldChar w:fldCharType="begin"/>
         </w:r>
@@ -4677,25 +4780,19 @@
           <w:rPr>
             <w:noProof/>
             <w:webHidden/>
-            <w:sz w:val="21"/>
-            <w:szCs w:val="21"/>
           </w:rPr>
-          <w:instrText xml:space="preserve"> PAGEREF _Toc231936656 \h </w:instrText>
+          <w:instrText xml:space="preserve"> PAGEREF _Toc232167495 \h </w:instrText>
         </w:r>
         <w:r>
           <w:rPr>
             <w:noProof/>
             <w:webHidden/>
-            <w:sz w:val="21"/>
-            <w:szCs w:val="21"/>
           </w:rPr>
         </w:r>
         <w:r>
           <w:rPr>
             <w:noProof/>
             <w:webHidden/>
-            <w:sz w:val="21"/>
-            <w:szCs w:val="21"/>
           </w:rPr>
           <w:fldChar w:fldCharType="separate"/>
         </w:r>
@@ -4703,8 +4800,6 @@
           <w:rPr>
             <w:noProof/>
             <w:webHidden/>
-            <w:sz w:val="21"/>
-            <w:szCs w:val="21"/>
           </w:rPr>
           <w:t>9</w:t>
         </w:r>
@@ -4712,8 +4807,88 @@
           <w:rPr>
             <w:noProof/>
             <w:webHidden/>
-            <w:sz w:val="21"/>
-            <w:szCs w:val="21"/>
+          </w:rPr>
+          <w:fldChar w:fldCharType="end"/>
+        </w:r>
+      </w:hyperlink>
+    </w:p>
+    <w:p>
+      <w:pPr>
+        <w:pStyle w:val="TableofFigures"/>
+        <w:tabs>
+          <w:tab w:val="right" w:leader="dot" w:pos="10070"/>
+        </w:tabs>
+        <w:rPr>
+          <w:rFonts w:eastAsiaTheme="minorEastAsia" w:cstheme="minorBidi"/>
+          <w:smallCaps w:val="0"/>
+          <w:noProof/>
+          <w:kern w:val="2"/>
+          <w:sz w:val="24"/>
+          <w:lang w:val="de-DE" w:eastAsia="de-DE"/>
+          <w14:ligatures w14:val="standardContextual"/>
+        </w:rPr>
+      </w:pPr>
+      <w:hyperlink w:anchor="_Toc232167496" w:history="1">
+        <w:r>
+          <w:rPr>
+            <w:rStyle w:val="Hyperlink"/>
+            <w:noProof/>
+          </w:rPr>
+          <w:t>Table 5</w:t>
+        </w:r>
+        <w:r>
+          <w:rPr>
+            <w:rStyle w:val="Hyperlink"/>
+            <w:noProof/>
+            <w:lang w:val="en-GB"/>
+          </w:rPr>
+          <w:t>:Version History</w:t>
+        </w:r>
+        <w:r>
+          <w:rPr>
+            <w:noProof/>
+            <w:webHidden/>
+          </w:rPr>
+          <w:tab/>
+        </w:r>
+        <w:r>
+          <w:rPr>
+            <w:noProof/>
+            <w:webHidden/>
+          </w:rPr>
+          <w:fldChar w:fldCharType="begin"/>
+        </w:r>
+        <w:r>
+          <w:rPr>
+            <w:noProof/>
+            <w:webHidden/>
+          </w:rPr>
+          <w:instrText xml:space="preserve"> PAGEREF _Toc232167496 \h </w:instrText>
+        </w:r>
+        <w:r>
+          <w:rPr>
+            <w:noProof/>
+            <w:webHidden/>
+          </w:rPr>
+        </w:r>
+        <w:r>
+          <w:rPr>
+            <w:noProof/>
+            <w:webHidden/>
+          </w:rPr>
+          <w:fldChar w:fldCharType="separate"/>
+        </w:r>
+        <w:r>
+          <w:rPr>
+            <w:noProof/>
+            <w:webHidden/>
+          </w:rPr>
+          <w:t>11</w:t>
+        </w:r>
+        <w:r>
+          <w:rPr>
+            <w:noProof/>
+            <w:webHidden/>
           </w:rPr>
           <w:fldChar w:fldCharType="end"/>
         </w:r>
@@ -4730,7 +4905,7 @@
       </w:pPr>
       <w:r>
         <w:rPr>
-          <w:smallCaps/>
+          <w:rFonts w:cs="Times New Roman"/>
           <w:sz w:val="21"/>
           <w:szCs w:val="21"/>
         </w:rPr>
@@ -4792,7 +4967,7 @@
         <w:pStyle w:val="Caption"/>
         <w:keepNext/>
       </w:pPr>
-      <w:bookmarkStart w:id="15" w:name="_Toc231936656"/>
+      <w:bookmarkStart w:id="15" w:name="_Toc232167495"/>
       <w:r>
         <w:t xml:space="preserve">Table </w:t>
       </w:r>
@@ -4812,31 +4987,38 @@
     <w:tbl>
       <w:tblPr>
         <w:tblStyle w:val="TestStyle1"/>
-        <w:tblW w:w="9360" w:type="dxa"/>
+        <w:tblW w:w="10146" w:type="dxa"/>
         <w:tblLook w:val="04A0" w:firstRow="1" w:lastRow="0" w:firstColumn="1" w:lastColumn="0" w:noHBand="0" w:noVBand="1"/>
       </w:tblPr>
       <w:tblGrid>
-        <w:gridCol w:w="539"/>
-        <w:gridCol w:w="2589"/>
-        <w:gridCol w:w="1197"/>
-        <w:gridCol w:w="1196"/>
-        <w:gridCol w:w="3839"/>
+        <w:gridCol w:w="584"/>
+        <w:gridCol w:w="2556"/>
+        <w:gridCol w:w="1238"/>
+        <w:gridCol w:w="1182"/>
+        <w:gridCol w:w="4586"/>
       </w:tblGrid>
       <w:tr>
-        <w:tc>
-          <w:tcPr>
-            <w:tcW w:w="539" w:type="dxa"/>
+        <w:trPr>
+          <w:trHeight w:val="344"/>
+        </w:trPr>
+        <w:tc>
+          <w:tcPr>
+            <w:tcW w:w="584" w:type="dxa"/>
+            <w:shd w:val="clear" w:color="auto" w:fill="1F3864"/>
           </w:tcPr>
           <w:p>
             <w:pPr>
               <w:spacing w:line="360" w:lineRule="auto"/>
               <w:jc w:val="center"/>
+              <w:rPr>
+                <w:color w:val="FFFFFF" w:themeColor="background1"/>
+              </w:rPr>
             </w:pPr>
             <w:r>
               <w:rPr>
                 <w:b/>
                 <w:bCs/>
-                <w:color w:val="1F3864"/>
+                <w:color w:val="FFFFFF" w:themeColor="background1"/>
               </w:rPr>
               <w:t>No.</w:t>
             </w:r>
@@ -4844,18 +5026,22 @@
         </w:tc>
         <w:tc>
           <w:tcPr>
-            <w:tcW w:w="2589" w:type="dxa"/>
+            <w:tcW w:w="2556" w:type="dxa"/>
+            <w:shd w:val="clear" w:color="auto" w:fill="1F3864"/>
           </w:tcPr>
           <w:p>
             <w:pPr>
               <w:spacing w:line="360" w:lineRule="auto"/>
               <w:jc w:val="center"/>
+              <w:rPr>
+                <w:color w:val="FFFFFF" w:themeColor="background1"/>
+              </w:rPr>
             </w:pPr>
             <w:r>
               <w:rPr>
                 <w:b/>
                 <w:bCs/>
-                <w:color w:val="1F3864"/>
+                <w:color w:val="FFFFFF" w:themeColor="background1"/>
               </w:rPr>
               <w:t>Document Name</w:t>
             </w:r>
@@ -4863,18 +5049,22 @@
         </w:tc>
         <w:tc>
           <w:tcPr>
-            <w:tcW w:w="1197" w:type="dxa"/>
+            <w:tcW w:w="1238" w:type="dxa"/>
+            <w:shd w:val="clear" w:color="auto" w:fill="1F3864"/>
           </w:tcPr>
           <w:p>
             <w:pPr>
               <w:spacing w:line="360" w:lineRule="auto"/>
               <w:jc w:val="center"/>
+              <w:rPr>
+                <w:color w:val="FFFFFF" w:themeColor="background1"/>
+              </w:rPr>
             </w:pPr>
             <w:r>
               <w:rPr>
                 <w:b/>
                 <w:bCs/>
-                <w:color w:val="1F3864"/>
+                <w:color w:val="FFFFFF" w:themeColor="background1"/>
               </w:rPr>
               <w:t>Version</w:t>
             </w:r>
@@ -4882,18 +5072,22 @@
         </w:tc>
         <w:tc>
           <w:tcPr>
-            <w:tcW w:w="1196" w:type="dxa"/>
+            <w:tcW w:w="1182" w:type="dxa"/>
+            <w:shd w:val="clear" w:color="auto" w:fill="1F3864"/>
           </w:tcPr>
           <w:p>
             <w:pPr>
               <w:spacing w:line="360" w:lineRule="auto"/>
               <w:jc w:val="center"/>
+              <w:rPr>
+                <w:color w:val="FFFFFF" w:themeColor="background1"/>
+              </w:rPr>
             </w:pPr>
             <w:r>
               <w:rPr>
                 <w:b/>
                 <w:bCs/>
-                <w:color w:val="1F3864"/>
+                <w:color w:val="FFFFFF" w:themeColor="background1"/>
               </w:rPr>
               <w:t>Date</w:t>
             </w:r>
@@ -4901,18 +5095,22 @@
         </w:tc>
         <w:tc>
           <w:tcPr>
-            <w:tcW w:w="3839" w:type="dxa"/>
+            <w:tcW w:w="4586" w:type="dxa"/>
+            <w:shd w:val="clear" w:color="auto" w:fill="1F3864"/>
           </w:tcPr>
           <w:p>
             <w:pPr>
               <w:spacing w:line="360" w:lineRule="auto"/>
               <w:jc w:val="center"/>
+              <w:rPr>
+                <w:color w:val="FFFFFF" w:themeColor="background1"/>
+              </w:rPr>
             </w:pPr>
             <w:r>
               <w:rPr>
                 <w:b/>
                 <w:bCs/>
-                <w:color w:val="1F3864"/>
+                <w:color w:val="FFFFFF" w:themeColor="background1"/>
               </w:rPr>
               <w:t>File Name</w:t>
             </w:r>
@@ -4920,9 +5118,12 @@
         </w:tc>
       </w:tr>
       <w:tr>
-        <w:tc>
-          <w:tcPr>
-            <w:tcW w:w="539" w:type="dxa"/>
+        <w:trPr>
+          <w:trHeight w:val="697"/>
+        </w:trPr>
+        <w:tc>
+          <w:tcPr>
+            <w:tcW w:w="584" w:type="dxa"/>
           </w:tcPr>
           <w:p>
             <w:pPr>
@@ -4942,7 +5143,7 @@
         </w:tc>
         <w:tc>
           <w:tcPr>
-            <w:tcW w:w="2589" w:type="dxa"/>
+            <w:tcW w:w="2556" w:type="dxa"/>
           </w:tcPr>
           <w:p>
             <w:pPr>
@@ -4961,7 +5162,7 @@
         </w:tc>
         <w:tc>
           <w:tcPr>
-            <w:tcW w:w="1197" w:type="dxa"/>
+            <w:tcW w:w="1238" w:type="dxa"/>
           </w:tcPr>
           <w:p>
             <w:pPr>
@@ -4977,17 +5178,11 @@
               </w:rPr>
               <w:t>1</w:t>
             </w:r>
-            <w:r>
-              <w:rPr>
-                <w:color w:val="000000"/>
-              </w:rPr>
-              <w:t>.1</w:t>
-            </w:r>
-          </w:p>
-        </w:tc>
-        <w:tc>
-          <w:tcPr>
-            <w:tcW w:w="1196" w:type="dxa"/>
+          </w:p>
+        </w:tc>
+        <w:tc>
+          <w:tcPr>
+            <w:tcW w:w="1182" w:type="dxa"/>
           </w:tcPr>
           <w:p>
             <w:pPr>
@@ -5001,19 +5196,13 @@
               <w:rPr>
                 <w:color w:val="000000"/>
               </w:rPr>
-              <w:t>2026-05-0</w:t>
-            </w:r>
-            <w:r>
-              <w:rPr>
-                <w:color w:val="000000"/>
-              </w:rPr>
-              <w:t>3</w:t>
-            </w:r>
-          </w:p>
-        </w:tc>
-        <w:tc>
-          <w:tcPr>
-            <w:tcW w:w="3839" w:type="dxa"/>
+              <w:t>2026-05-02</w:t>
+            </w:r>
+          </w:p>
+        </w:tc>
+        <w:tc>
+          <w:tcPr>
+            <w:tcW w:w="4586" w:type="dxa"/>
           </w:tcPr>
           <w:p>
             <w:pPr>
@@ -5026,27 +5215,19 @@
               <w:rPr>
                 <w:color w:val="1F3864"/>
               </w:rPr>
-              <w:t>LCP02-AIRBAG-ECU-001_Concept_v_</w:t>
-            </w:r>
-            <w:r>
-              <w:rPr>
-                <w:color w:val="1F3864"/>
-              </w:rPr>
-              <w:t>1</w:t>
-            </w:r>
-            <w:r>
-              <w:rPr>
-                <w:color w:val="1F3864"/>
-              </w:rPr>
-              <w:t>10.docx</w:t>
+              <w:t>LCP02-AIRBAG-ECU-001_Task_of_the_Process_or_Product_v100</w:t>
             </w:r>
           </w:p>
         </w:tc>
       </w:tr>
       <w:tr>
-        <w:tc>
-          <w:tcPr>
-            <w:tcW w:w="539" w:type="dxa"/>
+        <w:trPr>
+          <w:trHeight w:val="689"/>
+        </w:trPr>
+        <w:tc>
+          <w:tcPr>
+            <w:tcW w:w="584" w:type="dxa"/>
+            <w:shd w:val="clear" w:color="auto" w:fill="F2F8FD"/>
           </w:tcPr>
           <w:p>
             <w:pPr>
@@ -5060,7 +5241,8 @@
         </w:tc>
         <w:tc>
           <w:tcPr>
-            <w:tcW w:w="2589" w:type="dxa"/>
+            <w:tcW w:w="2556" w:type="dxa"/>
+            <w:shd w:val="clear" w:color="auto" w:fill="F2F8FD"/>
           </w:tcPr>
           <w:p>
             <w:pPr>
@@ -5076,7 +5258,8 @@
         </w:tc>
         <w:tc>
           <w:tcPr>
-            <w:tcW w:w="1197" w:type="dxa"/>
+            <w:tcW w:w="1238" w:type="dxa"/>
+            <w:shd w:val="clear" w:color="auto" w:fill="F2F8FD"/>
           </w:tcPr>
           <w:p>
             <w:pPr>
@@ -5084,13 +5267,17 @@
               <w:jc w:val="center"/>
             </w:pPr>
             <w:r>
-              <w:t>1.1</w:t>
-            </w:r>
-          </w:p>
-        </w:tc>
-        <w:tc>
-          <w:tcPr>
-            <w:tcW w:w="1196" w:type="dxa"/>
+              <w:rPr>
+                <w:color w:val="000000"/>
+              </w:rPr>
+              <w:t>2</w:t>
+            </w:r>
+          </w:p>
+        </w:tc>
+        <w:tc>
+          <w:tcPr>
+            <w:tcW w:w="1182" w:type="dxa"/>
+            <w:shd w:val="clear" w:color="auto" w:fill="F2F8FD"/>
           </w:tcPr>
           <w:p>
             <w:pPr>
@@ -5113,7 +5300,8 @@
         </w:tc>
         <w:tc>
           <w:tcPr>
-            <w:tcW w:w="3839" w:type="dxa"/>
+            <w:tcW w:w="4586" w:type="dxa"/>
+            <w:shd w:val="clear" w:color="auto" w:fill="F2F8FD"/>
           </w:tcPr>
           <w:p>
             <w:pPr>
@@ -5123,27 +5311,18 @@
               <w:rPr>
                 <w:color w:val="1F3864"/>
               </w:rPr>
-              <w:t>LCP03-AIRBAG-ECU-001_HARA_v1</w:t>
-            </w:r>
-            <w:r>
-              <w:rPr>
-                <w:color w:val="1F3864"/>
-              </w:rPr>
-              <w:t>1</w:t>
-            </w:r>
-            <w:r>
-              <w:rPr>
-                <w:color w:val="1F3864"/>
-              </w:rPr>
-              <w:t>0</w:t>
+              <w:t>LCP03-AIRBAG-ECU-001_HARA_v100</w:t>
             </w:r>
           </w:p>
         </w:tc>
       </w:tr>
       <w:tr>
-        <w:tc>
-          <w:tcPr>
-            <w:tcW w:w="539" w:type="dxa"/>
+        <w:trPr>
+          <w:trHeight w:val="1033"/>
+        </w:trPr>
+        <w:tc>
+          <w:tcPr>
+            <w:tcW w:w="584" w:type="dxa"/>
           </w:tcPr>
           <w:p>
             <w:pPr>
@@ -5157,23 +5336,23 @@
         </w:tc>
         <w:tc>
           <w:tcPr>
-            <w:tcW w:w="2589" w:type="dxa"/>
-          </w:tcPr>
-          <w:p>
-            <w:pPr>
-              <w:spacing w:line="360" w:lineRule="auto"/>
-            </w:pPr>
-            <w:r>
-              <w:rPr>
-                <w:color w:val="000000"/>
-              </w:rPr>
-              <w:t>Safety Concept Document</w:t>
-            </w:r>
-          </w:p>
-        </w:tc>
-        <w:tc>
-          <w:tcPr>
-            <w:tcW w:w="1197" w:type="dxa"/>
+            <w:tcW w:w="2556" w:type="dxa"/>
+          </w:tcPr>
+          <w:p>
+            <w:pPr>
+              <w:spacing w:line="360" w:lineRule="auto"/>
+            </w:pPr>
+            <w:r>
+              <w:rPr>
+                <w:color w:val="000000"/>
+              </w:rPr>
+              <w:t>Safety Concept Document — Airbag ECU</w:t>
+            </w:r>
+          </w:p>
+        </w:tc>
+        <w:tc>
+          <w:tcPr>
+            <w:tcW w:w="1238" w:type="dxa"/>
           </w:tcPr>
           <w:p>
             <w:pPr>
@@ -5190,7 +5369,7 @@
         </w:tc>
         <w:tc>
           <w:tcPr>
-            <w:tcW w:w="1196" w:type="dxa"/>
+            <w:tcW w:w="1182" w:type="dxa"/>
           </w:tcPr>
           <w:p>
             <w:pPr>
@@ -5207,13 +5386,13 @@
               <w:rPr>
                 <w:color w:val="000000"/>
               </w:rPr>
-              <w:t>06</w:t>
-            </w:r>
-          </w:p>
-        </w:tc>
-        <w:tc>
-          <w:tcPr>
-            <w:tcW w:w="3839" w:type="dxa"/>
+              <w:t>10</w:t>
+            </w:r>
+          </w:p>
+        </w:tc>
+        <w:tc>
+          <w:tcPr>
+            <w:tcW w:w="4586" w:type="dxa"/>
           </w:tcPr>
           <w:p>
             <w:pPr>
@@ -5223,39 +5402,19 @@
               <w:rPr>
                 <w:color w:val="1F3864"/>
               </w:rPr>
-              <w:t>LCP0</w:t>
-            </w:r>
-            <w:r>
-              <w:rPr>
-                <w:color w:val="1F3864"/>
-              </w:rPr>
-              <w:t>4</w:t>
-            </w:r>
-            <w:r>
-              <w:rPr>
-                <w:color w:val="1F3864"/>
-              </w:rPr>
-              <w:t>-AIRBAG-ECU-001_HARA_v1</w:t>
-            </w:r>
-            <w:r>
-              <w:rPr>
-                <w:color w:val="1F3864"/>
-              </w:rPr>
-              <w:t>1</w:t>
-            </w:r>
-            <w:r>
-              <w:rPr>
-                <w:color w:val="1F3864"/>
-              </w:rPr>
-              <w:t>0</w:t>
+              <w:t>LCP03-AIRBAG-ECU-001_HARA_v100</w:t>
             </w:r>
           </w:p>
         </w:tc>
       </w:tr>
       <w:tr>
-        <w:tc>
-          <w:tcPr>
-            <w:tcW w:w="539" w:type="dxa"/>
+        <w:trPr>
+          <w:trHeight w:val="1041"/>
+        </w:trPr>
+        <w:tc>
+          <w:tcPr>
+            <w:tcW w:w="584" w:type="dxa"/>
+            <w:shd w:val="clear" w:color="auto" w:fill="F2F8FD"/>
           </w:tcPr>
           <w:p>
             <w:pPr>
@@ -5269,7 +5428,8 @@
         </w:tc>
         <w:tc>
           <w:tcPr>
-            <w:tcW w:w="2589" w:type="dxa"/>
+            <w:tcW w:w="2556" w:type="dxa"/>
+            <w:shd w:val="clear" w:color="auto" w:fill="F2F8FD"/>
           </w:tcPr>
           <w:p>
             <w:pPr>
@@ -5285,7 +5445,8 @@
         </w:tc>
         <w:tc>
           <w:tcPr>
-            <w:tcW w:w="1197" w:type="dxa"/>
+            <w:tcW w:w="1238" w:type="dxa"/>
+            <w:shd w:val="clear" w:color="auto" w:fill="F2F8FD"/>
           </w:tcPr>
           <w:p>
             <w:pPr>
@@ -5302,7 +5463,8 @@
         </w:tc>
         <w:tc>
           <w:tcPr>
-            <w:tcW w:w="1196" w:type="dxa"/>
+            <w:tcW w:w="1182" w:type="dxa"/>
+            <w:shd w:val="clear" w:color="auto" w:fill="F2F8FD"/>
           </w:tcPr>
           <w:p>
             <w:pPr>
@@ -5313,7 +5475,8 @@
         </w:tc>
         <w:tc>
           <w:tcPr>
-            <w:tcW w:w="3839" w:type="dxa"/>
+            <w:tcW w:w="4586" w:type="dxa"/>
+            <w:shd w:val="clear" w:color="auto" w:fill="F2F8FD"/>
           </w:tcPr>
           <w:p>
             <w:pPr>
@@ -5323,9 +5486,12 @@
         </w:tc>
       </w:tr>
       <w:tr>
-        <w:tc>
-          <w:tcPr>
-            <w:tcW w:w="539" w:type="dxa"/>
+        <w:trPr>
+          <w:trHeight w:val="1033"/>
+        </w:trPr>
+        <w:tc>
+          <w:tcPr>
+            <w:tcW w:w="584" w:type="dxa"/>
           </w:tcPr>
           <w:p>
             <w:pPr>
@@ -5339,7 +5505,7 @@
         </w:tc>
         <w:tc>
           <w:tcPr>
-            <w:tcW w:w="2589" w:type="dxa"/>
+            <w:tcW w:w="2556" w:type="dxa"/>
           </w:tcPr>
           <w:p>
             <w:pPr>
@@ -5355,7 +5521,7 @@
         </w:tc>
         <w:tc>
           <w:tcPr>
-            <w:tcW w:w="1197" w:type="dxa"/>
+            <w:tcW w:w="1238" w:type="dxa"/>
           </w:tcPr>
           <w:p>
             <w:pPr>
@@ -5366,17 +5532,17 @@
         </w:tc>
         <w:tc>
           <w:tcPr>
-            <w:tcW w:w="1196" w:type="dxa"/>
-          </w:tcPr>
-          <w:p>
-            <w:pPr>
-              <w:spacing w:line="360" w:lineRule="auto"/>
-            </w:pPr>
-          </w:p>
-        </w:tc>
-        <w:tc>
-          <w:tcPr>
-            <w:tcW w:w="3839" w:type="dxa"/>
+            <w:tcW w:w="1182" w:type="dxa"/>
+          </w:tcPr>
+          <w:p>
+            <w:pPr>
+              <w:spacing w:line="360" w:lineRule="auto"/>
+            </w:pPr>
+          </w:p>
+        </w:tc>
+        <w:tc>
+          <w:tcPr>
+            <w:tcW w:w="4586" w:type="dxa"/>
           </w:tcPr>
           <w:p>
             <w:pPr>
@@ -5386,9 +5552,13 @@
         </w:tc>
       </w:tr>
       <w:tr>
-        <w:tc>
-          <w:tcPr>
-            <w:tcW w:w="539" w:type="dxa"/>
+        <w:trPr>
+          <w:trHeight w:val="689"/>
+        </w:trPr>
+        <w:tc>
+          <w:tcPr>
+            <w:tcW w:w="584" w:type="dxa"/>
+            <w:shd w:val="clear" w:color="auto" w:fill="F2F8FD"/>
           </w:tcPr>
           <w:p>
             <w:pPr>
@@ -5402,7 +5572,8 @@
         </w:tc>
         <w:tc>
           <w:tcPr>
-            <w:tcW w:w="2589" w:type="dxa"/>
+            <w:tcW w:w="2556" w:type="dxa"/>
+            <w:shd w:val="clear" w:color="auto" w:fill="F2F8FD"/>
           </w:tcPr>
           <w:p>
             <w:pPr>
@@ -5418,7 +5589,8 @@
         </w:tc>
         <w:tc>
           <w:tcPr>
-            <w:tcW w:w="1197" w:type="dxa"/>
+            <w:tcW w:w="1238" w:type="dxa"/>
+            <w:shd w:val="clear" w:color="auto" w:fill="F2F8FD"/>
           </w:tcPr>
           <w:p>
             <w:pPr>
@@ -5429,7 +5601,8 @@
         </w:tc>
         <w:tc>
           <w:tcPr>
-            <w:tcW w:w="1196" w:type="dxa"/>
+            <w:tcW w:w="1182" w:type="dxa"/>
+            <w:shd w:val="clear" w:color="auto" w:fill="F2F8FD"/>
           </w:tcPr>
           <w:p>
             <w:pPr>
@@ -5440,7 +5613,8 @@
         </w:tc>
         <w:tc>
           <w:tcPr>
-            <w:tcW w:w="3839" w:type="dxa"/>
+            <w:tcW w:w="4586" w:type="dxa"/>
+            <w:shd w:val="clear" w:color="auto" w:fill="F2F8FD"/>
           </w:tcPr>
           <w:p>
             <w:pPr>
@@ -5450,9 +5624,12 @@
         </w:tc>
       </w:tr>
       <w:tr>
-        <w:tc>
-          <w:tcPr>
-            <w:tcW w:w="539" w:type="dxa"/>
+        <w:trPr>
+          <w:trHeight w:val="697"/>
+        </w:trPr>
+        <w:tc>
+          <w:tcPr>
+            <w:tcW w:w="584" w:type="dxa"/>
           </w:tcPr>
           <w:p>
             <w:pPr>
@@ -5466,7 +5643,7 @@
         </w:tc>
         <w:tc>
           <w:tcPr>
-            <w:tcW w:w="2589" w:type="dxa"/>
+            <w:tcW w:w="2556" w:type="dxa"/>
           </w:tcPr>
           <w:p>
             <w:pPr>
@@ -5482,7 +5659,7 @@
         </w:tc>
         <w:tc>
           <w:tcPr>
-            <w:tcW w:w="1197" w:type="dxa"/>
+            <w:tcW w:w="1238" w:type="dxa"/>
           </w:tcPr>
           <w:p>
             <w:pPr>
@@ -5493,7 +5670,7 @@
         </w:tc>
         <w:tc>
           <w:tcPr>
-            <w:tcW w:w="1196" w:type="dxa"/>
+            <w:tcW w:w="1182" w:type="dxa"/>
           </w:tcPr>
           <w:p>
             <w:pPr>
@@ -5504,7 +5681,7 @@
         </w:tc>
         <w:tc>
           <w:tcPr>
-            <w:tcW w:w="3839" w:type="dxa"/>
+            <w:tcW w:w="4586" w:type="dxa"/>
           </w:tcPr>
           <w:p>
             <w:pPr>
@@ -5575,9 +5752,34 @@
       <w:bookmarkEnd w:id="17"/>
     </w:p>
     <w:p/>
+    <w:p>
+      <w:pPr>
+        <w:pStyle w:val="Caption"/>
+        <w:keepNext/>
+      </w:pPr>
+      <w:bookmarkStart w:id="18" w:name="_Toc232167496"/>
+      <w:r>
+        <w:t xml:space="preserve">Table </w:t>
+      </w:r>
+      <w:fldSimple w:instr=" SEQ Table \* ARABIC ">
+        <w:r>
+          <w:rPr>
+            <w:noProof/>
+          </w:rPr>
+          <w:t>5</w:t>
+        </w:r>
+      </w:fldSimple>
+      <w:r>
+        <w:rPr>
+          <w:lang w:val="en-GB"/>
+        </w:rPr>
+        <w:t>:Version History</w:t>
+      </w:r>
+      <w:bookmarkEnd w:id="18"/>
+    </w:p>
     <w:tbl>
       <w:tblPr>
-        <w:tblW w:w="9360" w:type="dxa"/>
+        <w:tblW w:w="10108" w:type="dxa"/>
         <w:tblBorders>
           <w:top w:val="single" w:sz="4" w:space="0" w:color="auto"/>
           <w:left w:val="single" w:sz="4" w:space="0" w:color="auto"/>
@@ -5593,14 +5795,17 @@
         <w:tblLook w:val="04A0" w:firstRow="1" w:lastRow="0" w:firstColumn="1" w:lastColumn="0" w:noHBand="0" w:noVBand="1"/>
       </w:tblPr>
       <w:tblGrid>
-        <w:gridCol w:w="2232"/>
-        <w:gridCol w:w="1595"/>
-        <w:gridCol w:w="5533"/>
+        <w:gridCol w:w="2410"/>
+        <w:gridCol w:w="1722"/>
+        <w:gridCol w:w="5976"/>
       </w:tblGrid>
       <w:tr>
-        <w:tc>
-          <w:tcPr>
-            <w:tcW w:w="2200" w:type="dxa"/>
+        <w:trPr>
+          <w:trHeight w:val="198"/>
+        </w:trPr>
+        <w:tc>
+          <w:tcPr>
+            <w:tcW w:w="2410" w:type="dxa"/>
             <w:tcBorders>
               <w:top w:val="single" w:sz="4" w:space="0" w:color="2E75B6"/>
               <w:left w:val="single" w:sz="4" w:space="0" w:color="2E75B6"/>
@@ -5634,7 +5839,7 @@
         </w:tc>
         <w:tc>
           <w:tcPr>
-            <w:tcW w:w="1600" w:type="dxa"/>
+            <w:tcW w:w="1722" w:type="dxa"/>
             <w:tcBorders>
               <w:top w:val="single" w:sz="4" w:space="0" w:color="2E75B6"/>
               <w:left w:val="single" w:sz="4" w:space="0" w:color="2E75B6"/>
@@ -5668,7 +5873,7 @@
         </w:tc>
         <w:tc>
           <w:tcPr>
-            <w:tcW w:w="5560" w:type="dxa"/>
+            <w:tcW w:w="5976" w:type="dxa"/>
             <w:tcBorders>
               <w:top w:val="single" w:sz="4" w:space="0" w:color="2E75B6"/>
               <w:left w:val="single" w:sz="4" w:space="0" w:color="2E75B6"/>
@@ -5702,9 +5907,12 @@
         </w:tc>
       </w:tr>
       <w:tr>
-        <w:tc>
-          <w:tcPr>
-            <w:tcW w:w="2200" w:type="dxa"/>
+        <w:trPr>
+          <w:trHeight w:val="402"/>
+        </w:trPr>
+        <w:tc>
+          <w:tcPr>
+            <w:tcW w:w="2410" w:type="dxa"/>
             <w:tcBorders>
               <w:top w:val="single" w:sz="4" w:space="0" w:color="BFBFBF"/>
               <w:left w:val="single" w:sz="4" w:space="0" w:color="BFBFBF"/>
@@ -5733,7 +5941,7 @@
         </w:tc>
         <w:tc>
           <w:tcPr>
-            <w:tcW w:w="1600" w:type="dxa"/>
+            <w:tcW w:w="1722" w:type="dxa"/>
             <w:tcBorders>
               <w:top w:val="single" w:sz="4" w:space="0" w:color="BFBFBF"/>
               <w:left w:val="single" w:sz="4" w:space="0" w:color="BFBFBF"/>
@@ -5797,7 +6005,7 @@
         </w:tc>
         <w:tc>
           <w:tcPr>
-            <w:tcW w:w="5560" w:type="dxa"/>
+            <w:tcW w:w="5976" w:type="dxa"/>
             <w:tcBorders>
               <w:top w:val="single" w:sz="4" w:space="0" w:color="BFBFBF"/>
               <w:left w:val="single" w:sz="4" w:space="0" w:color="BFBFBF"/>
@@ -7023,8 +7231,9 @@
       <w:ind w:left="400" w:hanging="400"/>
     </w:pPr>
     <w:rPr>
-      <w:rFonts w:asciiTheme="minorHAnsi" w:hAnsiTheme="minorHAnsi"/>
+      <w:rFonts w:asciiTheme="minorHAnsi" w:hAnsiTheme="minorHAnsi" w:cs="Times New Roman"/>
       <w:smallCaps/>
+      <w:szCs w:val="24"/>
     </w:rPr>
   </w:style>
   <w:style w:type="table" w:styleId="TableGrid">

</xml_diff>